<commit_message>
paper(revision): live Gemini re-evaluation, Turkish accuracy, proofreading pass
Co-Authored-By: Claude Opus 5.5 (1M context) <noreply@anthropic.com>
</commit_message>
<xml_diff>
--- a/paper/revision/manuscript/TranscriptionSync_revised.docx
+++ b/paper/revision/manuscript/TranscriptionSync_revised.docx
@@ -54,7 +54,7 @@
         <w:pStyle w:val="BodyText"/>
       </w:pPr>
       <w:r>
-        <w:t xml:space="preserve">Native-audio (speech-to-speech) large language models output raw PCM audio without phoneme timing, so avatar lip-sync pipelines that read a synthesizer's phoneme schedule no longer apply. We present TranscriptionSync, a training-free three-layer pipeline: word timing is recovered on the audio clock (Layer 1), each word interval is divided among its phonemes by articulatory-class duration weights (Layer 2), and 14 ARKit mouth blendshapes are synthesized with Gaussian-kernel co-articulation and a bilabial closure rule (Layer 3). We evaluate it layer by layer against articulation measured from video (593 held-out GRID utterances, MediaPipe ARKit ground truth) and in wall-clock time. With a streaming Whisper recognizer as Layer 1, the pipeline falls behind amplitude-driven baselines and its word-emission latency has a P95 of about 3.4 s on natural speech; a benchmark whose clock omits the window fill time reports only 214 ms. Exploiting the text transcription that native-audio APIs stream ahead of the audio, we replace recognition by streaming CTC forced alignment: on a CPU, it runs at about 45 ms per 160 ms hop with a P95 latency of 0.56–0.68 s on English (0.48 s on 50 re-collected Gemini Live responses with the live transcript timing enforced, where 89% of word starts fall within 100 ms of forced alignment; 92% on 25 Turkish responses), and the full pipeline then outperforms amplitude-only and rate-scheduled baselines and comes within 0.6% of NVIDIA Audio2Face-3D in blendshape distance (further behind in lip-mesh distance), while Layers 2–3 cost 0.3% of one core. We further show that SyncNet LSE-C/LSE-D are insensitive to ±200 ms offsets on stylized avatars whereas its bias-corrected offset estimate is valid, and we document two pitfalls of the public GRID distribution: silence-trimmed audio offset from the alignments, and mislabeled speaker folders. TranscriptionSync is integrated into A.T.L.A.S, an embodied desktop assistant on Gemini 2.5 Flash Native Audio.</w:t>
+        <w:t xml:space="preserve">Native-audio (speech-to-speech) large language models (LLMs) output raw PCM audio without phoneme timing, so lip-sync pipelines that read a synthesizer's phoneme schedule do not apply. We present TranscriptionSync, a training-free three-layer pipeline: word timing on the audio clock (Layer 1), phoneme durations within each word from articulatory-class weights (Layer 2), and 14 ARKit mouth blendshapes from kernel co-articulation with bilabial closure (Layer 3). We evaluate it layer by layer against video-measured articulation (593 held-out GRID utterances) and wall-clock latency. With a streaming Whisper recognizer as Layer 1, the pipeline falls behind amplitude-driven baselines and its P95 word-emission latency is about 3.4 s, although a benchmark clock omitting the window fill time reports 214 ms. An alignment variant instead aligns the transcript that the APIs stream ahead of the audio by streaming CTC forced alignment, at 45–56 ms per 160 ms hop on a CPU. Replaying the logged text timing of 50 Gemini Live responses, its P95 latency is 0.48 s and 89% of word starts fall within 100 ms of forced alignment (Turkish: 92%). On GRID, the pipeline outperforms amplitude-only and rate-scheduled animation in blendshape distance and JawOpen correlation, coming within about 0.5% of NVIDIA Audio2Face-3D in blendshape distance but behind it in mesh distance. SyncNet LSE-C/LSE-D are insensitive to ±200 ms offsets on stylized avatars, unlike SyncNet's bias-corrected offset estimate; the public GRID distribution pairs silence-trimmed audio with untrimmed alignments and mislabels speaker folders. TranscriptionSync is integrated into the A.T.L.A.S desktop assistant, which ships the rate-scheduled variant by default.</w:t>
       </w:r>
     </w:p>
     <w:p>
@@ -96,7 +96,7 @@
         <w:pStyle w:val="BodyText"/>
       </w:pPr>
       <w:r>
-        <w:t xml:space="preserve">This creates a new opportunity for embodied assistants and a specific technical problem: native-audio models output raw PCM audio with no phoneme timing. Phoneme-driven lip-sync pipelines that read the synthesizer's phoneme schedule [10] have no synthesizer to query, and forced alignment of the output audio [11] is non-causal. Learned audio-driven facial animation [12]–[14] operates on raw audio and has recently become streaming-capable and lightweight [15]–[19]; NVIDIA Audio2Face-3D, for example, now ships open weights and outputs ARKit blendshapes [15]. Commercial SDKs that add visemes to native-audio APIs [20], [21] publish neither their method nor an evaluation.</w:t>
+        <w:t xml:space="preserve">This creates a new opportunity for embodied assistants and a specific technical problem: native-audio models output raw PCM audio with no phoneme timing. Phoneme-driven lip-sync pipelines that read the synthesizer's phoneme schedule [10] have no synthesizer to query, and offline forced alignment of the output audio [11] is non-causal. Learned audio-driven facial animation [12]–[14] operates on raw audio and has recently become streaming-capable and lightweight [15]–[19]; NVIDIA Audio2Face-3D, for example, now ships open weights and outputs ARKit blendshapes [15]. Commercial SDKs that add visemes to native-audio APIs [20], [21] publish neither their method nor an evaluation.</w:t>
       </w:r>
     </w:p>
     <w:p>
@@ -104,7 +104,7 @@
         <w:pStyle w:val="BodyText"/>
       </w:pPr>
       <w:r>
-        <w:t xml:space="preserve">This paper studies a training-free alternative, TranscriptionSync, and asks where such a pipeline stands against learned models when all are measured against real articulation. Its premise is that what is being said can be recovered from the output audio: a lightweight speech recognizer supplies words and approximate word timing, and the remaining task is to place phonemes inside known word boundaries. The appeal is that the pipeline needs no training data, is interpretable phoneme by phoneme, extends to a new language through a grapheme-to-phoneme converter, and costs almost nothing once word timing is available. The contributions are:</w:t>
+        <w:t xml:space="preserve">This paper studies a training-free alternative, TranscriptionSync, and asks where such a pipeline stands against learned models when all are measured against real articulation. Its premise is that what is being said can be recovered: a lightweight speech recognizer supplies words and approximate word timing from the output audio or, better, the API's own transcript is aligned to the audio, and the remaining task is to place phonemes inside known word boundaries. The appeal is that the pipeline needs no training data, is interpretable phoneme by phoneme, extends to a new language through a grapheme-to-phoneme converter, and costs almost nothing once word timing is available. The contributions are:</w:t>
       </w:r>
     </w:p>
     <w:p>
@@ -167,7 +167,7 @@
         <w:t xml:space="preserve"> </w:t>
       </w:r>
       <w:r>
-        <w:t xml:space="preserve">(Section V-F): we identify a clock-origin error that makes sliding-window benchmarks report sub-300 ms latencies, show that sliding-window Whisper finalization yields a P95 word-emission latency of about 3.4 s on natural speech, and show that streaming CTC alignment of the known transcript reduces it to 0.56–0.68 s on a CPU, which makes the complete pipeline both real-time and more accurate than the simple baselines.</w:t>
+        <w:t xml:space="preserve">(Section V-F): we identify a clock-origin error that makes sliding-window benchmarks report sub-300 ms latencies, show that sliding-window Whisper finalization yields a P95 word-emission latency of about 3.4 s on natural speech, and show that streaming CTC alignment of the known transcript reduces it to 0.56–0.68 s for English on a CPU (in a simulator that replays logged Live API timing), which makes the complete pipeline both real-time and more accurate than the simple baselines in blendshape distance and JawOpen correlation.</w:t>
       </w:r>
     </w:p>
     <w:p>
@@ -185,7 +185,7 @@
         <w:t xml:space="preserve">Measurement pitfalls and their corrections</w:t>
       </w:r>
       <w:r>
-        <w:t xml:space="preserve">: an oracle that shares the evaluated representation inflates geometric agreement (Section V-C); SyncNet's LSE-C/LSE-D are offset-invariant on stylized avatars while its offset estimate remains valid after bias correction (Section V-C); the public GRID distribution pairs silence-trimmed audio with untrimmed alignments and mislabels 22 of 34 alignment folders, which, left uncorrected, degrades learned audio-to-blendshape models (Sections V-E and V-G).</w:t>
+        <w:t xml:space="preserve">: an oracle that shares the evaluated representation inflates geometric agreement (Sections V-C and V-D); SyncNet's LSE-C/LSE-D are offset-invariant on stylized avatars while its offset estimate remains valid after bias correction (Section V-C); the public GRID distribution pairs silence-trimmed audio with untrimmed alignments and mislabels 22 of 34 alignment folders, which, left uncorrected, degrades learned audio-to-blendshape models (Sections V-E and V-G).</w:t>
       </w:r>
     </w:p>
     <w:p>
@@ -193,7 +193,7 @@
         <w:pStyle w:val="FirstParagraph"/>
       </w:pPr>
       <w:r>
-        <w:t xml:space="preserve">Section II reviews related work, Section III describes the host system, Section IV presents the lip-sync method, Section V reports the objective evaluation, and Section VI discusses implications, limitations and future work.</w:t>
+        <w:t xml:space="preserve">Section II reviews related work, Section III describes the host system, Section IV presents the lip-sync method, Section V reports the objective evaluation, Section VI discusses implications, limitations and future work, and Section VII concludes.</w:t>
       </w:r>
     </w:p>
     <w:p>
@@ -344,7 +344,7 @@
         <w:pStyle w:val="FirstParagraph"/>
       </w:pPr>
       <w:r>
-        <w:t xml:space="preserve">TranscriptionSync occupies a different point in this space. It recovers the articulatory detail of family (i) under streaming causality by re-deriving word-level timing with a lightweight streaming recognizer and estimating phoneme durations within those words. It needs no training and runs on a CPU budget. We evaluate it against family (iii), against a lightweight learned CPU model of family (ii), and against a family-(i) oracle.</w:t>
+        <w:t xml:space="preserve">TranscriptionSync occupies a different point in this space. It recovers the articulatory detail of family (i) under streaming causality by re-deriving word-level timing with a lightweight streaming recognizer or, better, by aligning the API's own transcript to the audio, and estimating phoneme durations within those words. It needs no training and runs on a CPU budget. We evaluate it against family (iii), against a lightweight learned CPU model of family (ii), against NVIDIA Audio2Face-3D, and against a family-(i) oracle.</w:t>
       </w:r>
     </w:p>
     <w:p>
@@ -1697,7 +1697,7 @@
         <w:pStyle w:val="BodyText"/>
       </w:pPr>
       <w:r>
-        <w:t xml:space="preserve">Because the native-audio model provides no affect metadata, the displayed emotion is derived from the output transcription by a rule-based classifier with bilingual keyword dictionaries. Playback of the first audio chunk is held back briefly (≤ 650 ms) so that the expression is set before speech begins; this hold-back is part of the end-to-end latency budget (Section VI-B).</w:t>
+        <w:t xml:space="preserve">Because the native-audio model provides no affect metadata, the displayed emotion is derived from the output transcription by a rule-based classifier with bilingual keyword dictionaries. Playback of the first audio chunk is held back briefly (≤ 650 ms) so that the expression is set before speech begins; this hold-back is part of the end-to-end latency budget (unmeasured; Section VI-B).</w:t>
       </w:r>
     </w:p>
     <w:p>
@@ -1725,7 +1725,7 @@
         <w:pStyle w:val="BodyText"/>
       </w:pPr>
       <w:r>
-        <w:t xml:space="preserve">The native-audio model produces, for each response, a sequence of 24 kHz PCM chunks a₁, a₂, …. It may also emit an asynchronous stream of transcription text chunks without timestamps, lagging the audio by an unknown offset. The API provides no phoneme labels, positions or durations. The objective is to drive M = 14 mouth blendshape channels b(t) ∈ [0,1]^M at 60 Hz so that articulation is plausible and synchronized with the audio, causally and in real time on a CPU.</w:t>
+        <w:t xml:space="preserve">The native-audio model produces, for each response, a sequence of 24 kHz PCM chunks a₁, a₂, …. It may also emit an asynchronous stream of transcription text chunks without timestamps and with an unknown offset relative to the audio (for Gemini Live, the text leads; Section IV-B). The API provides no phoneme labels, positions or durations. The objective is to drive M = 14 mouth blendshape channels b(t) ∈ [0,1]^M at 60 Hz so that articulation is plausible and synchronized with the audio, causally and in real time on a CPU.</w:t>
       </w:r>
     </w:p>
     <w:p>
@@ -1733,7 +1733,7 @@
         <w:pStyle w:val="BodyText"/>
       </w:pPr>
       <w:r>
-        <w:t xml:space="preserve">Amplitude-only approaches set jaw aperture from short-term energy. They are synchronous but carry no articulation: no lip closure for /m, b, p/, no rounding for /u, o/ and no spreading for /i, e/. Forced alignment recovers accurate phoneme timing but needs the entire utterance and 10²–10³ ms of computation. TranscriptionSync divides the problem into three stages: inexpensive recovery of word-level timing (Layer 1), estimation of phoneme timing within the recovered words (Layer 2), and synthesis of co-articulated blendshape trajectories from the timed phonemes (Layer 3).</w:t>
+        <w:t xml:space="preserve">Amplitude-only approaches set jaw aperture from short-term energy. They are synchronous but carry no articulation: no lip closure for /m, b, p/, no rounding for /u, o/ and no spreading for /i, e/. Offline forced alignment (e.g., MFA) recovers accurate phoneme timing but needs the entire utterance and 10²–10³ ms of computation. TranscriptionSync divides the problem into three stages: inexpensive recovery of word-level timing (Layer 1), estimation of phoneme timing within the recovered words (Layer 2), and synthesis of co-articulated blendshape trajectories from the timed phonemes (Layer 3).</w:t>
       </w:r>
     </w:p>
     <w:p>
@@ -1769,7 +1769,7 @@
         <w:t xml:space="preserve"> </w:t>
       </w:r>
       <w:r>
-        <w:t xml:space="preserve">variant (TSYNC-ASR), incoming PCM chunks are appended to a rolling buffer and transcribed incrementally by an int8-quantized multilingual Whisper model on the CPU [31], [48] with word-level timestamps. Inference runs on a window of W = 3.2 s with hop h = 320 ms. A word wᵢ is finalized once its end time tᵢᵉ lies more than a guard interval g behind the buffer head; it is then emitted as the triple (textᵢ, tᵢˢ, tᵢᵉ) and not refined further. The recognizer does not need to be highly accurate. Substitution errors tend to replace a word with a phonetically similar one, whose visemes are also similar, which is consistent with the gradual degradation observed in the layer-wise experiments (Section V-E).</w:t>
+        <w:t xml:space="preserve">variant (TSYNC-ASR), incoming PCM chunks are appended to a rolling buffer and transcribed incrementally by an int8-quantized multilingual Whisper model on the CPU [31], [48] with word-level timestamps. Inference runs on a window of W = 3.2 s with hop h = 320 ms. A word wᵢ is finalized once its end time tᵢᵉ lies more than a guard interval g behind the buffer head; it is then emitted as the triple (textᵢ, tᵢˢ, tᵢᵉ) and not refined further. Substitution errors are partly tolerated: they tend to replace a word with a phonetically similar one, whose visemes are also similar, which is consistent with the gradual degradation observed in the layer-wise experiments (Section V-E).</w:t>
       </w:r>
     </w:p>
     <w:p>
@@ -1777,7 +1777,7 @@
         <w:pStyle w:val="BodyText"/>
       </w:pPr>
       <w:r>
-        <w:t xml:space="preserve">Whisper-family models tie their decoding clock to the onset of speech. When a window begins with silence, word timestamps are shifted by an amount related to the leading silence, which appears directly as audio-visual desynchronization. The remedy is energy-based onset detection: the window is trimmed at the first sustained above-threshold RMS frame (minus an 80 ms margin), transcribed, and the trimmed offset is added back so that emitted timestamps refer to the stream clock. This correction is used in the GRID layer-wise validation (Section V-E), but the TSYNC implementation evaluated on the live-system material (Section V-C) does not apply it. On GRID audio with natural leading silence, adding it reduces the word-start error of the streaming recognizer from 169 to 90 ms (Section V-D), so it should be considered part of Layer 1.</w:t>
+        <w:t xml:space="preserve">Whisper-family models tie their decoding clock to the onset of speech. When a window begins with silence, word timestamps are shifted by an amount related to the leading silence, which appears directly as audio-visual desynchronization. The remedy is energy-based onset detection: the window is trimmed at the first sustained above-threshold RMS frame (minus an 80 ms margin), transcribed, and the trimmed offset is added back so that emitted timestamps refer to the stream clock. This correction is used in the GRID layer-wise validation (Section V-E), but the TSYNC (small) configuration of Tables 4 and 6 does not apply it. On GRID audio with natural leading silence, adding it reduces the word-start error of the streaming recognizer from 169 to 90 ms (Section V-D), so it should be considered part of Layer 1.</w:t>
       </w:r>
     </w:p>
     <w:p>
@@ -1801,7 +1801,7 @@
         <w:t xml:space="preserve"> </w:t>
       </w:r>
       <w:r>
-        <w:t xml:space="preserve">variant (TSYNC-CTC), Layer 1 does not recognize words at all. Native-audio APIs stream a text transcription of the response alongside the audio; for Gemini Live, the first transcription chunk arrives a mean 690 ms before the first audio chunk (50 responses, Section V-C), and further words follow at roughly speaking rate. Layer 1 then only has to place known words on the audio clock, which is a streaming forced-alignment problem. Every hop (h = 160 ms), a compact CTC acoustic model (wav2vec2-base fine-tuned for English character recognition, 94 M parameters [49]; the multilingual MMS aligner, 315 M parameters [50], for other languages) computes character posteriors for the audio since the last committed word (plus a 300 ms left margin), and a free-end CTC Viterbi pass aligns the next words of the transcript to them, so that the best-scoring</w:t>
+        <w:t xml:space="preserve">variant (TSYNC-CTC), Layer 1 does not recognize words at all. Native-audio APIs stream a text transcription of the response alongside the audio; for Gemini Live, the first transcription chunk arrives a mean 690 ms before the first audio chunk (50 responses, Section V-C), and further words follow at roughly speaking rate. Layer 1 then only has to place known words on the audio clock, which is a streaming forced-alignment problem. Every hop (h = 160 ms; 320 ms for MMS on the CPU), a compact CTC acoustic model (wav2vec2-base fine-tuned for English character recognition, 94 M parameters [49]; the multilingual MMS aligner, 315 M parameters [50], for other languages) computes character posteriors for the audio since the last committed word (plus a 300 ms left margin), and a free-end CTC Viterbi pass aligns the next words of the transcript to them, so that the best-scoring</w:t>
       </w:r>
       <w:r>
         <w:t xml:space="preserve"> </w:t>
@@ -1841,7 +1841,7 @@
         <w:pStyle w:val="BodyText"/>
       </w:pPr>
       <w:r>
-        <w:t xml:space="preserve">where L_g2p and L_syn are the (sub-millisecond) latencies of Layers 2 and 3. Δ is the single user-tunable parameter: it increases voice-to-voice response time but does not by itself introduce desynchronization. Equation (3) presupposes that the recognizer keeps up with the stream on average, that is, that per-window compute does not exceed the hop h. Otherwise L grows without bound and no finite Δ suffices (Section V-F). The playout buffer hides</w:t>
+        <w:t xml:space="preserve">where L_g2p and L_syn are the (sub-millisecond) latencies of Layers 2 and 3. Δ is the single user-tunable parameter: it increases voice-to-voice response time but does not by itself introduce desynchronization. Equation (3) presupposes that the recognizer keeps up with the stream on average, that is, that per-window compute does not exceed the hop h. Otherwise L grows without bound and no finite Δ suffices, unless the recognizer skips ahead to the most recent audio, as our implementation does (Section V-F). The playout buffer hides</w:t>
       </w:r>
       <w:r>
         <w:t xml:space="preserve"> </w:t>
@@ -2631,7 +2631,7 @@
         <w:pStyle w:val="BodyText"/>
       </w:pPr>
       <w:r>
-        <w:t xml:space="preserve">Layers 2 and 3 are computationally negligible: G2P is a dictionary or rule lookup, and frame synthesis costs O(M · J_local), about 0.05 ms per frame and 0.3% of one CPU core in total (Section V-F). The latency and compute budget is therefore set by Layer 1. With sliding-window Whisper recognition (W = 3.2 s, h = 320 ms, g = 400 ms), per-window compute is a few hundred milliseconds for the tiny model, and the recognizer occupies a full core; the word-emission latency measured in wall-clock time has a P95 of about 3.4 s on natural speech (Section V-F), so Eq. (3) requires Δ ≈ 3.4 s. This makes the finalization policy of the recognition variant, rather than recognizer size, the component to improve. The alignment variant avoids it: with the transcript known, a CTC aligner costs about 45 ms per 160 ms hop on the CPU and emits words with a P95 latency of 0.56–0.68 s on English speech (Section V-F), so Eq. (3) is satisfied with Δ ≈ 0.7 s.</w:t>
+        <w:t xml:space="preserve">Layers 2 and 3 are computationally negligible: G2P is a dictionary or rule lookup, and frame synthesis costs O(M · J_local), about 0.05 ms per frame and 0.3% of one CPU core in total (Section V-F). The latency and compute budget is therefore set by Layer 1. With sliding-window Whisper recognition (W = 3.2 s, h = 320 ms, g = 400 ms), per-window compute is a few hundred milliseconds for the tiny and base models and on English exceeds the hop (Table 9), so the recognizer occupies a full core and keeps up only by skipping ahead; the word-emission latency measured in wall-clock time has a P95 of about 3.4 s on natural speech (Section V-F), so Eq. (3) requires Δ ≈ 3.4 s. This makes the finalization policy of the recognition variant, rather than recognizer size, the component to improve. The alignment variant avoids it: with the transcript known, a CTC aligner costs 45–56 ms per 160 ms hop on the CPU and emits words with a P95 latency of 0.56–0.68 s on English speech (Section V-F), so Eq. (3) is satisfied with Δ ≈ 0.7 s for English; for Turkish, Δ ≈ 1.2 s on the CPU or ≈ 0.8 s on a GPU.</w:t>
       </w:r>
     </w:p>
     <w:p>
@@ -2651,7 +2651,7 @@
         <w:pStyle w:val="BodyText"/>
       </w:pPr>
       <w:r>
-        <w:t xml:space="preserve">Without the streaming recognizer, A.T.L.A.S runs a production variant that uses the API's untimed output transcription. This is the default configuration of the shipped system, and it is released as the open-source package transcription-sync (Appendix A). Letters of the transcription stream are consumed at a fixed articulation rate of ρ = 13 characters/s (≈150 words/min) and mapped through the grapheme-class viseme table of Table 3; spaces and punctuation render the inter-word closure pose. Each target pose is scaled by the audio amplitude: the RMS of each PCM chunk is compressed as E = min(0.42, 1.9 · RMS^0.55), smoothed by an asymmetric follower (attack 0.50, release 0.18), and applied as the gain g = min(1.4, 2.2 · E). When a pose does not specify MouthClose, a light rest closure max(0, 0.08 − 0.2 · JawOpen) is added. Poses are then smoothed per channel by a first-order filter (β = 0.40) applied once per character, that is, at the 13 Hz character cadence. In the live system the character clock starts when the first transcription chunk arrives, which precedes the audio by 349 ms on average (live measurement, n = 7 turns); the offline port used in Section V aligns it to the audio onset instead. The variant is training-free, ASR-free and adds no latency, but its timing is open-loop: articulation shapes and audio are coupled only through signal energy, and the character cadence is not re-anchored to the audio.</w:t>
+        <w:t xml:space="preserve">Without the streaming recognizer, A.T.L.A.S runs a production variant that uses the API's untimed output transcription. This is the default configuration of the shipped system, and it is available in the project repository as the package transcription-sync (Appendix A). Letters of the transcription stream are consumed at a fixed articulation rate of ρ = 13 characters/s (≈150 words/min) and mapped through a grapheme-class viseme table (released; Table 3 lists the corresponding phoneme classes); spaces and punctuation render the inter-word closure pose. Each target pose is scaled by the audio amplitude: the RMS of each PCM chunk is compressed as E = min(0.42, 1.9 · RMS^0.55), smoothed by an asymmetric follower (attack 0.50, release 0.18), and applied as the gain g = min(1.4, 2.2 · E). When a pose does not specify MouthClose, a light rest closure max(0, 0.08 − 0.2 · JawOpen) is added. Poses are then smoothed per channel by a first-order filter (β = 0.40) applied once per character, that is, at the 13 Hz character cadence. In the live system the character clock starts when the first transcription chunk arrives, which precedes the audio by a mean 690 ms (n = 50 re-collected responses, Section V-C; an earlier in-app measurement over n = 7 turns gave 349 ms); the offline port used in Section V aligns it to the audio onset instead. The variant is training-free, ASR-free and adds no latency, but its timing is open-loop: articulation shapes and audio are coupled only through signal energy, and the character cadence is not re-anchored to the audio.</w:t>
       </w:r>
     </w:p>
     <w:p>
@@ -2742,7 +2742,7 @@
         <w:t xml:space="preserve"> </w:t>
       </w:r>
       <w:r>
-        <w:t xml:space="preserve">The causal audio-to-ARKit Transformer of Section V-G (Architecture A, 1.21 M parameters, released checkpoint trained on GRID s1–s28), run on the CPU. It represents the lightweight learned sub-family of Section II-D(ii). Oculus/Meta Lipsync and uLipSync, the other members of that sub-family, are distributed only as Unity/native plug-ins for Windows, macOS and mobile targets and could not be run in our Linux evaluation pipeline. Because the 50 live-system recordings are not part of the released material, LEARNED is evaluated on GRID (Section V-D) and not in Table 4.</w:t>
+        <w:t xml:space="preserve">The causal audio-to-ARKit Transformer of Section V-G (Architecture A, 1.21 M parameters, released checkpoint trained on GRID s1–s28 with offset audio and rule-derived labels; Section V-G), run on the CPU. It represents the lightweight learned sub-family of Section II-D(ii). Oculus/Meta Lipsync and uLipSync, the other members of that sub-family, are distributed only as Unity/native plug-ins for Windows, macOS and mobile targets and could not be run in our Linux evaluation pipeline. LEARNED is evaluated on GRID (Section V-D) and not in Table 4.</w:t>
       </w:r>
     </w:p>
     <w:p>
@@ -2763,7 +2763,7 @@
         <w:t xml:space="preserve"> </w:t>
       </w:r>
       <w:r>
-        <w:t xml:space="preserve">The full TranscriptionSync pipeline of Sections IV-B–IV-D.</w:t>
+        <w:t xml:space="preserve">The full TranscriptionSync pipeline of Sections IV-B–IV-D. Without a suffix, TSYNC denotes the recognition variant with the Whisper small recognizer (TSYNC-ASR-small), the configuration of the original evaluation.</w:t>
       </w:r>
     </w:p>
     <w:p>
@@ -2837,7 +2837,7 @@
         <w:t xml:space="preserve"> </w:t>
       </w:r>
       <w:r>
-        <w:t xml:space="preserve">(nearest-phoneme step targets replacing the kernel regression of Eq. (6)).</w:t>
+        <w:t xml:space="preserve">(nearest-phoneme step targets replacing the kernel regression of Eq. (6)). Sections V-C and V-D add further conditions: LEARNED-sync, Audio2Face-3D, TSYNC-ASR (tiny, onset-corrected), TSYNC-trim, TSYNC-refwords and TSYNC-CTC.</w:t>
       </w:r>
     </w:p>
     <w:p>
@@ -2889,7 +2889,7 @@
         <w:t xml:space="preserve"> </w:t>
       </w:r>
       <w:r>
-        <w:t xml:space="preserve">model. The reference transcript for the MFA oracle and the RATE condition is the Live API output transcription, unedited, as the live system would receive it. Each condition was rendered at 1080p/60 fps with frame-accurate audio multiplexing (six conditions × 50 utterances = 300 videos) and downscaled to 640×480/25 fps, the SyncNet input format. Fig. 2 shows one utterance rendered under the four anchor conditions at the same instant. The avatar is an untextured mesh without skin texture, lip color, teeth texture or eye texture, which is stylistically far from the natural face video used to train SyncNet.</w:t>
+        <w:t xml:space="preserve">model. This TSYNC configuration is therefore idealized: with small, per-window compute exceeds the hop, so it is not real-time on our CPU (Table 9). The reference transcript for the MFA oracle and the RATE condition is the Live API output transcription, unedited, as the live system would receive it. Each condition was rendered at 1080p/60 fps with frame-accurate audio multiplexing (six conditions × 50 utterances = 300 videos) and downscaled to 640×480/25 fps, the SyncNet input format. Figure 2 shows one utterance rendered under the four anchor conditions at the same instant. The avatar is an untextured mesh without skin texture, lip color, teeth texture or eye texture, which is stylistically far from the natural face video used to train SyncNet.</w:t>
       </w:r>
     </w:p>
     <w:p>
@@ -2926,7 +2926,7 @@
         <w:t xml:space="preserve">Lip vertex distance (LVD)</w:t>
       </w:r>
       <w:r>
-        <w:t xml:space="preserve">: the mean per-frame L2 distance between the 400 most morph-affected lip-region vertices of the evaluation mesh and those of the mesh driven by the MFA oracle, in normalized model units; MFA has LVD = 0 by definition. LVD measures proximity to the oracle</w:t>
+        <w:t xml:space="preserve">: the mean per-frame L2 distance between the 400 most morph-affected lip-region vertices of the evaluation mesh and those of the mesh driven by the MFA oracle, in normalized model units; MFA has LVD = 0 by definition. Tables 4 and 6 label this quantity LVD_oracle. LVD measures proximity to the oracle</w:t>
       </w:r>
       <w:r>
         <w:t xml:space="preserve"> </w:t>
@@ -3074,7 +3074,7 @@
         <w:t xml:space="preserve"> </w:t>
       </w:r>
       <w:r>
-        <w:t xml:space="preserve">Objective synchronization by condition; mean (SD) over N = 50 utterances. SyncNet face detection succeeded on 45–46 of 50 renders per condition; renders without a score are excluded from LSE-D/LSE-C. LVD and lag are computed on all 50. Timing err. is the word-start MAE against MFA over content-matched tokens (Section V-E convention: recognizer insertions and deletions are discarded, not paired by position). Negative lag = visemes lead audio. Significance, effect sizes and bootstrap CIs are given in the text.</w:t>
+        <w:t xml:space="preserve">Objective synchronization by condition; mean (SD) over N = 50 utterances. SyncNet face detection succeeded on 45–46 of 50 renders per condition; renders without a score are excluded from LSE-D/LSE-C. LVD_oracle: lip vertex distance to the MFA-driven mesh, which shares TSYNC's viseme representation (Section V-B). LVD_oracle and lag are computed on all 50. Timing err. is the word-start MAE against MFA over content-matched tokens (Section V-E convention: recognizer insertions and deletions are discarded, not paired by position). Negative lag = visemes lead audio. Significance, effect sizes and bootstrap CIs are given in the text.</w:t>
       </w:r>
     </w:p>
     <w:tbl>
@@ -3185,7 +3185,7 @@
                 <w:bCs/>
                 <w:sz w:val="18"/>
               </w:rPr>
-              <w:t xml:space="preserve">LVD ↓</w:t>
+              <w:t xml:space="preserve">LVD_oracle ↓</w:t>
             </w:r>
           </w:p>
         </w:tc>
@@ -4068,7 +4068,7 @@
         <w:t xml:space="preserve"> </w:t>
       </w:r>
       <w:r>
-        <w:t xml:space="preserve">AMP and MFA score almost identically and best (LSE-D ≈ 11.7, LSE-C ≈ 2.9), while RATE and all TSYNC variants score worse (LSE-D ≈ 13.1–13.5, LSE-C ≈ 0.8–1.4). Both AMP and MFA are significantly better than TSYNC on LSE-D (paired p &lt; 10⁻⁸ and p &lt; 10⁻¹³). Within the lower-scoring group, TSYNC's LSE-D is marginally but significantly below RATE's (13.15 vs. 13.49, p &lt; 10⁻⁴), but this 0.34-unit gap is small against the ≈1.4-unit deficit relative to AMP and MFA. Four observations indicate that LSE-D/LSE-C do not measure lip-sync quality on this avatar.</w:t>
+        <w:t xml:space="preserve">AMP and MFA score almost identically and best (LSE-D ≈ 11.7, LSE-C ≈ 2.9), while RATE and all TSYNC variants score worse (LSE-D ≈ 13.1–13.5, LSE-C ≈ 0.8–1.4). Both AMP and MFA are significantly better than TSYNC on LSE-D (paired p &lt; 10⁻⁸ and p &lt; 10⁻¹³). Within the lower-scoring group, TSYNC's LSE-D is marginally but significantly below RATE's (13.15 vs. 13.49, p &lt; 10⁻⁴), but this 0.34-unit gap is small against the ≈ 1.5-unit deficit relative to AMP and MFA. Three observations indicate that LSE-D/LSE-C do not measure lip-sync quality on this avatar.</w:t>
       </w:r>
     </w:p>
     <w:p>
@@ -4131,7 +4131,7 @@
         <w:t xml:space="preserve">its offset estimate is biased on this representation</w:t>
       </w:r>
       <w:r>
-        <w:t xml:space="preserve">. AMP is synchronous by construction, yet SyncNet estimates an audio-visual offset of +73 ms (95% CI [+69, +77], p = 2×10⁻¹⁰), with a similar ≈ +70 ms bias on MFA (p = 3×10⁻⁸), roughly two video frames of systematic error under exact synchronization.</w:t>
+        <w:t xml:space="preserve">. AMP is synchronous by construction, yet SyncNet estimates an audio-visual offset of +73 ms (95% CI [+69, +77], p = 2×10⁻¹⁰), with a similar ≈ +70 ms bias on MFA (p = 3×10⁻⁸), roughly two video frames of systematic error under exact synchronization. The SyncNet offset estimate tracks the mouth–audio lag of Table 4 with Pearson r = 0.40 (Spearman ρ = 0.69).</w:t>
       </w:r>
     </w:p>
     <w:p>
@@ -4149,7 +4149,7 @@
         <w:t xml:space="preserve"> </w:t>
       </w:r>
       <w:r>
-        <w:t xml:space="preserve">To separate what SyncNet does and does not measure on this avatar, we rendered 20 FLEURS English utterances [53] (natural read speech, mean 9.1 s, independent of the evaluation material) with the AMP trajectory displaced by known offsets of −200 to +200 ms (nine offsets, 180 videos), plus RATE, TSYNC (small recognizer) and MFA at zero offset, and scored all 240 videos with the same SyncNet pipeline (Table 5).</w:t>
+        <w:t xml:space="preserve">To separate what SyncNet does and does not measure on this avatar, we rendered 20 FLEURS English utterances [53] (natural read speech, mean 10.0 s; the same utterances as in Section V-F; independent of the evaluation material) with the AMP trajectory displaced by known offsets of −200 to +200 ms (nine offsets, 180 videos), plus RATE, TSYNC (small recognizer) and MFA at zero offset, and scored all 240 videos with the same SyncNet pipeline (Table 5).</w:t>
       </w:r>
     </w:p>
     <w:p>
@@ -4168,7 +4168,7 @@
         <w:t xml:space="preserve"> </w:t>
       </w:r>
       <w:r>
-        <w:t xml:space="preserve">SyncNet on controlled displacements of the AMP trajectory (20 FLEURS-en utterances per row; positive shift = visemes late). Offset: SyncNet's estimated audio-visual offset, mean ± SD over utterances.</w:t>
+        <w:t xml:space="preserve">SyncNet on controlled displacements of the AMP trajectory (20 FLEURS-en utterances per row; five of the nine imposed shifts shown; positive shift = visemes late). Offset: SyncNet's estimated audio-visual offset, mean ± SD over utterances.</w:t>
       </w:r>
     </w:p>
     <w:tbl>
@@ -5124,13 +5124,21 @@
           <w:b/>
           <w:bCs/>
         </w:rPr>
-        <w:t xml:space="preserve">Live timing accuracy is of the same order as on GRID.</w:t>
-      </w:r>
-      <w:r>
-        <w:t xml:space="preserve"> </w:t>
-      </w:r>
-      <w:r>
-        <w:t xml:space="preserve">The live word-start MAE against MFA, on content-matched tokens, is 86 ms (SD 18; median 89 ms; mean token-match rate 85%). The released compute_metrics.py pairs words by position instead, which yields 1 380.9 ms; content-matched scoring is implemented in live_pipeline.py (Section V-C, re-collected material). This compares with the Layer-1 word-start MAE of 69 ms measured on GRID with the same recognizer (Section V-E, Table 8), so the controlled-corpus timing result carries over to conversational live speech with moderate degradation. The error decomposes into a per-utterance constant offset (median −65 ms, visemes early; Section IV-B) and a 64 ms within-utterance residual. The playout buffer does not remove the constant offset, since it shifts audio and visemes together, and the offset is visible in the rendered lag of −52.7 ms. Because the offset is predominantly negative (visemes leading), it falls on the tolerant side of the BT.1359 window, and its median can be removed by a fixed compensation term added to Layer-1 timestamps. On GRID, such a compensation reduces the word-start MAE of the onset-corrected recognizer from 90 to 50 ms (Section V-D). On the re-collected live material below, compensating the global median offset lowers the word-start MAE of the Whisper small recognizer from 83 to 64 ms. The within-utterance residual is not removable in this way. The measurement must use content-matched tokens: pairing predicted and reference words by sequence index, which is invalid under conversational ASR where a single insertion or deletion shifts every subsequent word, inflates the apparent MAE by more than an order of magnitude and reflects word-sequence misalignment rather than articulation timing.</w:t>
+        <w:t xml:space="preserve">Live timing accuracy is comparable to the GRID results.</w:t>
+      </w:r>
+      <w:r>
+        <w:t xml:space="preserve"> </w:t>
+      </w:r>
+      <w:r>
+        <w:t xml:space="preserve">The live word-start MAE against MFA, on content-matched tokens, is 86 ms (SD 18; median 89 ms; mean token-match rate 85%). The compute_metrics.py script, which is available in the project repository, pairs words by position instead, which yields 1 380.9 ms; content-matched scoring is implemented in live_pipeline.py (see the re-collected material below). This compares with a Layer-1 word-start MAE on GRID of 69 ms for the tiny recognizer (Section V-E, Table 8) and 90 ms for the small recognizer with onset correction (Section V-D), so the controlled-corpus timing result carries over to conversational live speech with moderate degradation. The error decomposes into a per-utterance constant offset (median −65 ms, visemes early; Section IV-B) and a 64 ms within-utterance residual. The playout buffer does not remove the constant offset, since it shifts audio and visemes together, and the offset is visible in the rendered lag of −52.7 ms. Because the offset is predominantly negative (visemes leading), it falls on the tolerant side of the BT.1359 window, and its median can be removed by a fixed compensation term added to Layer-1 timestamps. On GRID, such a compensation reduces the word-start MAE of the onset-corrected recognizer from 90 to 50 ms (Section V-D). On the re-collected live material below, compensating the global median offset lowers the word-start MAE of the Whisper small recognizer from 83 to 64 ms. The within-utterance residual is not removable in this way.</w:t>
+      </w:r>
+    </w:p>
+    <w:p>
+      <w:pPr>
+        <w:pStyle w:val="BodyText"/>
+      </w:pPr>
+      <w:r>
+        <w:t xml:space="preserve">The measurement must use content-matched tokens: pairing predicted and reference words by sequence index, which is invalid under conversational ASR where a single insertion or deletion shifts every subsequent word, inflates the apparent MAE by more than an order of magnitude and reflects word-sequence misalignment rather than articulation timing.</w:t>
       </w:r>
     </w:p>
     <w:p>
@@ -5148,7 +5156,7 @@
         <w:t xml:space="preserve"> </w:t>
       </w:r>
       <w:r>
-        <w:t xml:space="preserve">Because the original 50 recordings are not part of the released material, we collected a new set with the same model, voice, persona and prompts (50 English responses, mean 15.7 ± 4.7 s, range 2.8–24.3 s, 2 216 words; plus 25 Turkish responses to translated prompts, mean 17.7 s, 971 words), this time logging the arrival time of every audio and text chunk. The MFA reference is aligned to the unedited Live API transcription (english_us_arpa; turkish_mfa for Turkish). TSYNC-CTC is run as it would run live: a word can be aligned only after its text chunk has arrived. Table 6 repeats the metrics of Table 4 on this material, with word timing scored over content-matched tokens.</w:t>
+        <w:t xml:space="preserve">Because the original 50 recordings are not part of the released material, we collected a new set with the same model, voice, persona and prompts (50 English responses, mean 15.7 ± 4.7 s, range 2.8–24.3 s, 2 216 words; plus 25 Turkish responses to translated prompts, mean 17.7 s, 971 words), this time logging the arrival time of every audio and text chunk. The first text chunk arrives a mean 690 ms (median 637 ms) before the first audio chunk. The MFA reference is aligned to the unedited Live API transcription (english_us_arpa; turkish_mfa for Turkish). TSYNC-CTC is run in a simulator that replays the logged chunk arrival times, as it would run live: a word can be aligned only after its text chunk has arrived. Table 6 repeats the metrics of Table 4 on this material, with word timing scored over content-matched tokens.</w:t>
       </w:r>
     </w:p>
     <w:p>
@@ -5167,7 +5175,7 @@
         <w:t xml:space="preserve"> </w:t>
       </w:r>
       <w:r>
-        <w:t xml:space="preserve">Re-collected Gemini Live material. LVD to the MFA-driven mesh (mean [bootstrap 95% CI]; shares the MFA oracle's representation, see text), envelope lag (mean ± SD) and content-matched word-start timing against MFA. TSYNC (small) is the configuration of Table 4; TSYNC-ASR uses the tiny recognizer with onset correction.</w:t>
+        <w:t xml:space="preserve">Re-collected Gemini Live material. LVD_oracle: LVD to the MFA-driven mesh (mean [bootstrap 95% CI]; shares the MFA oracle's representation, see text), envelope lag (mean ± SD) and content-matched word-start timing against MFA. TSYNC (small) is the configuration of Table 4; TSYNC-ASR (tiny, onset-corrected) uses the tiny recognizer with onset correction.</w:t>
       </w:r>
     </w:p>
     <w:tbl>
@@ -5187,12 +5195,12 @@
         <w:tblLook w:firstRow="1" w:lastRow="0" w:firstColumn="0" w:lastColumn="0" w:noHBand="0" w:noVBand="0" w:val="0020"/>
       </w:tblPr>
       <w:tblGrid>
-        <w:gridCol w:w="974"/>
-        <w:gridCol w:w="1949"/>
-        <w:gridCol w:w="2436"/>
-        <w:gridCol w:w="1096"/>
-        <w:gridCol w:w="2314"/>
-        <w:gridCol w:w="977"/>
+        <w:gridCol w:w="803"/>
+        <w:gridCol w:w="3315"/>
+        <w:gridCol w:w="2009"/>
+        <w:gridCol w:w="904"/>
+        <w:gridCol w:w="1909"/>
+        <w:gridCol w:w="806"/>
       </w:tblGrid>
       <w:tr>
         <w:trPr>
@@ -5200,7 +5208,7 @@
         </w:trPr>
         <w:tc>
           <w:tcPr>
-            <w:tcW w:w="974" w:type="dxa"/>
+            <w:tcW w:w="803" w:type="dxa"/>
             <w:shd w:val="clear" w:color="auto" w:fill="BDD7EE"/>
           </w:tcPr>
           <w:p>
@@ -5221,7 +5229,7 @@
         </w:tc>
         <w:tc>
           <w:tcPr>
-            <w:tcW w:w="1949" w:type="dxa"/>
+            <w:tcW w:w="3315" w:type="dxa"/>
             <w:shd w:val="clear" w:color="auto" w:fill="BDD7EE"/>
           </w:tcPr>
           <w:p>
@@ -5242,7 +5250,7 @@
         </w:tc>
         <w:tc>
           <w:tcPr>
-            <w:tcW w:w="2436" w:type="dxa"/>
+            <w:tcW w:w="2009" w:type="dxa"/>
             <w:shd w:val="clear" w:color="auto" w:fill="BDD7EE"/>
           </w:tcPr>
           <w:p>
@@ -5257,13 +5265,13 @@
                 <w:bCs/>
                 <w:sz w:val="18"/>
               </w:rPr>
-              <w:t xml:space="preserve">LVD ↓</w:t>
-            </w:r>
-          </w:p>
-        </w:tc>
-        <w:tc>
-          <w:tcPr>
-            <w:tcW w:w="1096" w:type="dxa"/>
+              <w:t xml:space="preserve">LVD_oracle ↓</w:t>
+            </w:r>
+          </w:p>
+        </w:tc>
+        <w:tc>
+          <w:tcPr>
+            <w:tcW w:w="904" w:type="dxa"/>
             <w:shd w:val="clear" w:color="auto" w:fill="BDD7EE"/>
           </w:tcPr>
           <w:p>
@@ -5284,7 +5292,7 @@
         </w:tc>
         <w:tc>
           <w:tcPr>
-            <w:tcW w:w="2314" w:type="dxa"/>
+            <w:tcW w:w="1909" w:type="dxa"/>
             <w:shd w:val="clear" w:color="auto" w:fill="BDD7EE"/>
           </w:tcPr>
           <w:p>
@@ -5305,7 +5313,7 @@
         </w:tc>
         <w:tc>
           <w:tcPr>
-            <w:tcW w:w="977" w:type="dxa"/>
+            <w:tcW w:w="806" w:type="dxa"/>
             <w:shd w:val="clear" w:color="auto" w:fill="BDD7EE"/>
           </w:tcPr>
           <w:p>
@@ -5328,7 +5336,7 @@
       <w:tr>
         <w:tc>
           <w:tcPr>
-            <w:tcW w:w="974" w:type="dxa"/>
+            <w:tcW w:w="803" w:type="dxa"/>
           </w:tcPr>
           <w:p>
             <w:pPr>
@@ -5346,7 +5354,7 @@
         </w:tc>
         <w:tc>
           <w:tcPr>
-            <w:tcW w:w="1949" w:type="dxa"/>
+            <w:tcW w:w="3315" w:type="dxa"/>
           </w:tcPr>
           <w:p>
             <w:pPr>
@@ -5364,7 +5372,7 @@
         </w:tc>
         <w:tc>
           <w:tcPr>
-            <w:tcW w:w="2436" w:type="dxa"/>
+            <w:tcW w:w="2009" w:type="dxa"/>
           </w:tcPr>
           <w:p>
             <w:pPr>
@@ -5382,7 +5390,7 @@
         </w:tc>
         <w:tc>
           <w:tcPr>
-            <w:tcW w:w="1096" w:type="dxa"/>
+            <w:tcW w:w="904" w:type="dxa"/>
           </w:tcPr>
           <w:p>
             <w:pPr>
@@ -5400,7 +5408,7 @@
         </w:tc>
         <w:tc>
           <w:tcPr>
-            <w:tcW w:w="2314" w:type="dxa"/>
+            <w:tcW w:w="1909" w:type="dxa"/>
           </w:tcPr>
           <w:p>
             <w:pPr>
@@ -5418,7 +5426,7 @@
         </w:tc>
         <w:tc>
           <w:tcPr>
-            <w:tcW w:w="977" w:type="dxa"/>
+            <w:tcW w:w="806" w:type="dxa"/>
           </w:tcPr>
           <w:p>
             <w:pPr>
@@ -5438,7 +5446,7 @@
       <w:tr>
         <w:tc>
           <w:tcPr>
-            <w:tcW w:w="974" w:type="dxa"/>
+            <w:tcW w:w="803" w:type="dxa"/>
           </w:tcPr>
           <w:p>
             <w:pPr>
@@ -5456,7 +5464,7 @@
         </w:tc>
         <w:tc>
           <w:tcPr>
-            <w:tcW w:w="1949" w:type="dxa"/>
+            <w:tcW w:w="3315" w:type="dxa"/>
           </w:tcPr>
           <w:p>
             <w:pPr>
@@ -5474,7 +5482,7 @@
         </w:tc>
         <w:tc>
           <w:tcPr>
-            <w:tcW w:w="2436" w:type="dxa"/>
+            <w:tcW w:w="2009" w:type="dxa"/>
           </w:tcPr>
           <w:p>
             <w:pPr>
@@ -5492,7 +5500,7 @@
         </w:tc>
         <w:tc>
           <w:tcPr>
-            <w:tcW w:w="1096" w:type="dxa"/>
+            <w:tcW w:w="904" w:type="dxa"/>
           </w:tcPr>
           <w:p>
             <w:pPr>
@@ -5510,7 +5518,7 @@
         </w:tc>
         <w:tc>
           <w:tcPr>
-            <w:tcW w:w="2314" w:type="dxa"/>
+            <w:tcW w:w="1909" w:type="dxa"/>
           </w:tcPr>
           <w:p>
             <w:pPr>
@@ -5528,7 +5536,7 @@
         </w:tc>
         <w:tc>
           <w:tcPr>
-            <w:tcW w:w="977" w:type="dxa"/>
+            <w:tcW w:w="806" w:type="dxa"/>
           </w:tcPr>
           <w:p>
             <w:pPr>
@@ -5548,7 +5556,7 @@
       <w:tr>
         <w:tc>
           <w:tcPr>
-            <w:tcW w:w="974" w:type="dxa"/>
+            <w:tcW w:w="803" w:type="dxa"/>
           </w:tcPr>
           <w:p>
             <w:pPr>
@@ -5566,7 +5574,7 @@
         </w:tc>
         <w:tc>
           <w:tcPr>
-            <w:tcW w:w="1949" w:type="dxa"/>
+            <w:tcW w:w="3315" w:type="dxa"/>
           </w:tcPr>
           <w:p>
             <w:pPr>
@@ -5584,7 +5592,7 @@
         </w:tc>
         <w:tc>
           <w:tcPr>
-            <w:tcW w:w="2436" w:type="dxa"/>
+            <w:tcW w:w="2009" w:type="dxa"/>
           </w:tcPr>
           <w:p>
             <w:pPr>
@@ -5602,7 +5610,7 @@
         </w:tc>
         <w:tc>
           <w:tcPr>
-            <w:tcW w:w="1096" w:type="dxa"/>
+            <w:tcW w:w="904" w:type="dxa"/>
           </w:tcPr>
           <w:p>
             <w:pPr>
@@ -5620,7 +5628,7 @@
         </w:tc>
         <w:tc>
           <w:tcPr>
-            <w:tcW w:w="2314" w:type="dxa"/>
+            <w:tcW w:w="1909" w:type="dxa"/>
           </w:tcPr>
           <w:p>
             <w:pPr>
@@ -5638,7 +5646,7 @@
         </w:tc>
         <w:tc>
           <w:tcPr>
-            <w:tcW w:w="977" w:type="dxa"/>
+            <w:tcW w:w="806" w:type="dxa"/>
           </w:tcPr>
           <w:p>
             <w:pPr>
@@ -5658,7 +5666,7 @@
       <w:tr>
         <w:tc>
           <w:tcPr>
-            <w:tcW w:w="974" w:type="dxa"/>
+            <w:tcW w:w="803" w:type="dxa"/>
           </w:tcPr>
           <w:p>
             <w:pPr>
@@ -5676,25 +5684,25 @@
         </w:tc>
         <w:tc>
           <w:tcPr>
-            <w:tcW w:w="1949" w:type="dxa"/>
-          </w:tcPr>
-          <w:p>
-            <w:pPr>
-              <w:pStyle w:val="Compact"/>
-              <w:spacing w:after="20" w:before="20"/>
-              <w:jc w:val="left"/>
-            </w:pPr>
-            <w:r>
-              <w:rPr>
-                <w:sz w:val="18"/>
-              </w:rPr>
-              <w:t xml:space="preserve">TSYNC-ASR (tiny)</w:t>
-            </w:r>
-          </w:p>
-        </w:tc>
-        <w:tc>
-          <w:tcPr>
-            <w:tcW w:w="2436" w:type="dxa"/>
+            <w:tcW w:w="3315" w:type="dxa"/>
+          </w:tcPr>
+          <w:p>
+            <w:pPr>
+              <w:pStyle w:val="Compact"/>
+              <w:spacing w:after="20" w:before="20"/>
+              <w:jc w:val="left"/>
+            </w:pPr>
+            <w:r>
+              <w:rPr>
+                <w:sz w:val="18"/>
+              </w:rPr>
+              <w:t xml:space="preserve">TSYNC-ASR (tiny, onset-corrected)</w:t>
+            </w:r>
+          </w:p>
+        </w:tc>
+        <w:tc>
+          <w:tcPr>
+            <w:tcW w:w="2009" w:type="dxa"/>
           </w:tcPr>
           <w:p>
             <w:pPr>
@@ -5712,7 +5720,7 @@
         </w:tc>
         <w:tc>
           <w:tcPr>
-            <w:tcW w:w="1096" w:type="dxa"/>
+            <w:tcW w:w="904" w:type="dxa"/>
           </w:tcPr>
           <w:p>
             <w:pPr>
@@ -5730,7 +5738,7 @@
         </w:tc>
         <w:tc>
           <w:tcPr>
-            <w:tcW w:w="2314" w:type="dxa"/>
+            <w:tcW w:w="1909" w:type="dxa"/>
           </w:tcPr>
           <w:p>
             <w:pPr>
@@ -5748,7 +5756,7 @@
         </w:tc>
         <w:tc>
           <w:tcPr>
-            <w:tcW w:w="977" w:type="dxa"/>
+            <w:tcW w:w="806" w:type="dxa"/>
           </w:tcPr>
           <w:p>
             <w:pPr>
@@ -5768,7 +5776,7 @@
       <w:tr>
         <w:tc>
           <w:tcPr>
-            <w:tcW w:w="974" w:type="dxa"/>
+            <w:tcW w:w="803" w:type="dxa"/>
           </w:tcPr>
           <w:p>
             <w:pPr>
@@ -5786,7 +5794,7 @@
         </w:tc>
         <w:tc>
           <w:tcPr>
-            <w:tcW w:w="1949" w:type="dxa"/>
+            <w:tcW w:w="3315" w:type="dxa"/>
           </w:tcPr>
           <w:p>
             <w:pPr>
@@ -5806,7 +5814,7 @@
         </w:tc>
         <w:tc>
           <w:tcPr>
-            <w:tcW w:w="2436" w:type="dxa"/>
+            <w:tcW w:w="2009" w:type="dxa"/>
           </w:tcPr>
           <w:p>
             <w:pPr>
@@ -5826,7 +5834,7 @@
         </w:tc>
         <w:tc>
           <w:tcPr>
-            <w:tcW w:w="1096" w:type="dxa"/>
+            <w:tcW w:w="904" w:type="dxa"/>
           </w:tcPr>
           <w:p>
             <w:pPr>
@@ -5846,7 +5854,7 @@
         </w:tc>
         <w:tc>
           <w:tcPr>
-            <w:tcW w:w="2314" w:type="dxa"/>
+            <w:tcW w:w="1909" w:type="dxa"/>
           </w:tcPr>
           <w:p>
             <w:pPr>
@@ -5864,7 +5872,7 @@
         </w:tc>
         <w:tc>
           <w:tcPr>
-            <w:tcW w:w="977" w:type="dxa"/>
+            <w:tcW w:w="806" w:type="dxa"/>
           </w:tcPr>
           <w:p>
             <w:pPr>
@@ -5886,7 +5894,7 @@
       <w:tr>
         <w:tc>
           <w:tcPr>
-            <w:tcW w:w="974" w:type="dxa"/>
+            <w:tcW w:w="803" w:type="dxa"/>
           </w:tcPr>
           <w:p>
             <w:pPr>
@@ -5904,7 +5912,7 @@
         </w:tc>
         <w:tc>
           <w:tcPr>
-            <w:tcW w:w="1949" w:type="dxa"/>
+            <w:tcW w:w="3315" w:type="dxa"/>
           </w:tcPr>
           <w:p>
             <w:pPr>
@@ -5922,7 +5930,7 @@
         </w:tc>
         <w:tc>
           <w:tcPr>
-            <w:tcW w:w="2436" w:type="dxa"/>
+            <w:tcW w:w="2009" w:type="dxa"/>
           </w:tcPr>
           <w:p>
             <w:pPr>
@@ -5940,7 +5948,7 @@
         </w:tc>
         <w:tc>
           <w:tcPr>
-            <w:tcW w:w="1096" w:type="dxa"/>
+            <w:tcW w:w="904" w:type="dxa"/>
           </w:tcPr>
           <w:p>
             <w:pPr>
@@ -5958,7 +5966,7 @@
         </w:tc>
         <w:tc>
           <w:tcPr>
-            <w:tcW w:w="2314" w:type="dxa"/>
+            <w:tcW w:w="1909" w:type="dxa"/>
           </w:tcPr>
           <w:p>
             <w:pPr>
@@ -5976,7 +5984,7 @@
         </w:tc>
         <w:tc>
           <w:tcPr>
-            <w:tcW w:w="977" w:type="dxa"/>
+            <w:tcW w:w="806" w:type="dxa"/>
           </w:tcPr>
           <w:p>
             <w:pPr>
@@ -5996,7 +6004,7 @@
       <w:tr>
         <w:tc>
           <w:tcPr>
-            <w:tcW w:w="974" w:type="dxa"/>
+            <w:tcW w:w="803" w:type="dxa"/>
           </w:tcPr>
           <w:p>
             <w:pPr>
@@ -6014,7 +6022,7 @@
         </w:tc>
         <w:tc>
           <w:tcPr>
-            <w:tcW w:w="1949" w:type="dxa"/>
+            <w:tcW w:w="3315" w:type="dxa"/>
           </w:tcPr>
           <w:p>
             <w:pPr>
@@ -6032,7 +6040,7 @@
         </w:tc>
         <w:tc>
           <w:tcPr>
-            <w:tcW w:w="2436" w:type="dxa"/>
+            <w:tcW w:w="2009" w:type="dxa"/>
           </w:tcPr>
           <w:p>
             <w:pPr>
@@ -6050,7 +6058,7 @@
         </w:tc>
         <w:tc>
           <w:tcPr>
-            <w:tcW w:w="1096" w:type="dxa"/>
+            <w:tcW w:w="904" w:type="dxa"/>
           </w:tcPr>
           <w:p>
             <w:pPr>
@@ -6068,7 +6076,7 @@
         </w:tc>
         <w:tc>
           <w:tcPr>
-            <w:tcW w:w="2314" w:type="dxa"/>
+            <w:tcW w:w="1909" w:type="dxa"/>
           </w:tcPr>
           <w:p>
             <w:pPr>
@@ -6086,7 +6094,7 @@
         </w:tc>
         <w:tc>
           <w:tcPr>
-            <w:tcW w:w="977" w:type="dxa"/>
+            <w:tcW w:w="806" w:type="dxa"/>
           </w:tcPr>
           <w:p>
             <w:pPr>
@@ -6106,7 +6114,7 @@
       <w:tr>
         <w:tc>
           <w:tcPr>
-            <w:tcW w:w="974" w:type="dxa"/>
+            <w:tcW w:w="803" w:type="dxa"/>
           </w:tcPr>
           <w:p>
             <w:pPr>
@@ -6124,7 +6132,7 @@
         </w:tc>
         <w:tc>
           <w:tcPr>
-            <w:tcW w:w="1949" w:type="dxa"/>
+            <w:tcW w:w="3315" w:type="dxa"/>
           </w:tcPr>
           <w:p>
             <w:pPr>
@@ -6142,7 +6150,7 @@
         </w:tc>
         <w:tc>
           <w:tcPr>
-            <w:tcW w:w="2436" w:type="dxa"/>
+            <w:tcW w:w="2009" w:type="dxa"/>
           </w:tcPr>
           <w:p>
             <w:pPr>
@@ -6160,7 +6168,7 @@
         </w:tc>
         <w:tc>
           <w:tcPr>
-            <w:tcW w:w="1096" w:type="dxa"/>
+            <w:tcW w:w="904" w:type="dxa"/>
           </w:tcPr>
           <w:p>
             <w:pPr>
@@ -6178,7 +6186,7 @@
         </w:tc>
         <w:tc>
           <w:tcPr>
-            <w:tcW w:w="2314" w:type="dxa"/>
+            <w:tcW w:w="1909" w:type="dxa"/>
           </w:tcPr>
           <w:p>
             <w:pPr>
@@ -6196,7 +6204,7 @@
         </w:tc>
         <w:tc>
           <w:tcPr>
-            <w:tcW w:w="977" w:type="dxa"/>
+            <w:tcW w:w="806" w:type="dxa"/>
           </w:tcPr>
           <w:p>
             <w:pPr>
@@ -6216,7 +6224,7 @@
       <w:tr>
         <w:tc>
           <w:tcPr>
-            <w:tcW w:w="974" w:type="dxa"/>
+            <w:tcW w:w="803" w:type="dxa"/>
           </w:tcPr>
           <w:p>
             <w:pPr>
@@ -6234,7 +6242,7 @@
         </w:tc>
         <w:tc>
           <w:tcPr>
-            <w:tcW w:w="1949" w:type="dxa"/>
+            <w:tcW w:w="3315" w:type="dxa"/>
           </w:tcPr>
           <w:p>
             <w:pPr>
@@ -6252,7 +6260,7 @@
         </w:tc>
         <w:tc>
           <w:tcPr>
-            <w:tcW w:w="2436" w:type="dxa"/>
+            <w:tcW w:w="2009" w:type="dxa"/>
           </w:tcPr>
           <w:p>
             <w:pPr>
@@ -6270,7 +6278,7 @@
         </w:tc>
         <w:tc>
           <w:tcPr>
-            <w:tcW w:w="1096" w:type="dxa"/>
+            <w:tcW w:w="904" w:type="dxa"/>
           </w:tcPr>
           <w:p>
             <w:pPr>
@@ -6288,7 +6296,7 @@
         </w:tc>
         <w:tc>
           <w:tcPr>
-            <w:tcW w:w="2314" w:type="dxa"/>
+            <w:tcW w:w="1909" w:type="dxa"/>
           </w:tcPr>
           <w:p>
             <w:pPr>
@@ -6306,7 +6314,7 @@
         </w:tc>
         <w:tc>
           <w:tcPr>
-            <w:tcW w:w="977" w:type="dxa"/>
+            <w:tcW w:w="806" w:type="dxa"/>
           </w:tcPr>
           <w:p>
             <w:pPr>
@@ -6326,7 +6334,7 @@
       <w:tr>
         <w:tc>
           <w:tcPr>
-            <w:tcW w:w="974" w:type="dxa"/>
+            <w:tcW w:w="803" w:type="dxa"/>
           </w:tcPr>
           <w:p>
             <w:pPr>
@@ -6344,7 +6352,7 @@
         </w:tc>
         <w:tc>
           <w:tcPr>
-            <w:tcW w:w="1949" w:type="dxa"/>
+            <w:tcW w:w="3315" w:type="dxa"/>
           </w:tcPr>
           <w:p>
             <w:pPr>
@@ -6364,7 +6372,7 @@
         </w:tc>
         <w:tc>
           <w:tcPr>
-            <w:tcW w:w="2436" w:type="dxa"/>
+            <w:tcW w:w="2009" w:type="dxa"/>
           </w:tcPr>
           <w:p>
             <w:pPr>
@@ -6384,7 +6392,7 @@
         </w:tc>
         <w:tc>
           <w:tcPr>
-            <w:tcW w:w="1096" w:type="dxa"/>
+            <w:tcW w:w="904" w:type="dxa"/>
           </w:tcPr>
           <w:p>
             <w:pPr>
@@ -6402,7 +6410,7 @@
         </w:tc>
         <w:tc>
           <w:tcPr>
-            <w:tcW w:w="2314" w:type="dxa"/>
+            <w:tcW w:w="1909" w:type="dxa"/>
           </w:tcPr>
           <w:p>
             <w:pPr>
@@ -6420,7 +6428,7 @@
         </w:tc>
         <w:tc>
           <w:tcPr>
-            <w:tcW w:w="977" w:type="dxa"/>
+            <w:tcW w:w="806" w:type="dxa"/>
           </w:tcPr>
           <w:p>
             <w:pPr>
@@ -6442,7 +6450,7 @@
       <w:tr>
         <w:tc>
           <w:tcPr>
-            <w:tcW w:w="974" w:type="dxa"/>
+            <w:tcW w:w="803" w:type="dxa"/>
           </w:tcPr>
           <w:p>
             <w:pPr>
@@ -6460,7 +6468,7 @@
         </w:tc>
         <w:tc>
           <w:tcPr>
-            <w:tcW w:w="1949" w:type="dxa"/>
+            <w:tcW w:w="3315" w:type="dxa"/>
           </w:tcPr>
           <w:p>
             <w:pPr>
@@ -6478,7 +6486,7 @@
         </w:tc>
         <w:tc>
           <w:tcPr>
-            <w:tcW w:w="2436" w:type="dxa"/>
+            <w:tcW w:w="2009" w:type="dxa"/>
           </w:tcPr>
           <w:p>
             <w:pPr>
@@ -6496,7 +6504,7 @@
         </w:tc>
         <w:tc>
           <w:tcPr>
-            <w:tcW w:w="1096" w:type="dxa"/>
+            <w:tcW w:w="904" w:type="dxa"/>
           </w:tcPr>
           <w:p>
             <w:pPr>
@@ -6514,7 +6522,7 @@
         </w:tc>
         <w:tc>
           <w:tcPr>
-            <w:tcW w:w="2314" w:type="dxa"/>
+            <w:tcW w:w="1909" w:type="dxa"/>
           </w:tcPr>
           <w:p>
             <w:pPr>
@@ -6532,7 +6540,7 @@
         </w:tc>
         <w:tc>
           <w:tcPr>
-            <w:tcW w:w="977" w:type="dxa"/>
+            <w:tcW w:w="806" w:type="dxa"/>
           </w:tcPr>
           <w:p>
             <w:pPr>
@@ -6555,7 +6563,7 @@
         <w:pStyle w:val="BodyText"/>
       </w:pPr>
       <w:r>
-        <w:t xml:space="preserve">The re-collected material reproduces the original Table 4 closely (AMP 0.523 vs. 0.520, RATE 0.563 vs. 0.556, TSYNC 0.456 vs. 0.461; lags −57 vs. −53 ms and +101 vs. +91 ms), and the content-matched word-start MAE of the small recognizer is 83 ms, against 86 ms reported for the original material. With live text availability enforced, TSYNC-CTC has the lowest LVD in both languages (Wilcoxon against every other condition, p &lt; 10⁻¹³ in English and p &lt; 10⁻⁴ in Turkish), zero lag and the most accurate word timing (89% and 92% of word starts within 100 ms of MFA). Its wall-clock word-emission latency on the CPU is 293 ms (median) / 479 ms (P95) in English (56 ms compute per 160 ms hop) and 511 / 866 ms in Turkish with the larger MMS aligner, or 250 / 520 ms on a GPU. The LVD values in Table 6 must be read with the caveat of Table 4, amplified here: the oracle shares TSYNC's viseme representation</w:t>
+        <w:t xml:space="preserve">The re-collected material reproduces the original Table 4 closely (AMP 0.523 vs. 0.520, RATE 0.563 vs. 0.556, TSYNC 0.456 vs. 0.461; lags −57 vs. −53 ms and +101 vs. +91 ms), and the content-matched word-start MAE of the small recognizer is 83 ms, against 86 ms reported for the original material. With live text availability enforced, TSYNC-CTC has the lowest LVD in both languages (Wilcoxon against every other condition, p &lt; 10⁻¹³ in English and p &lt; 10⁻⁴ in Turkish), near-zero mean lag, the lowest median word-start error and the highest share of word starts within 100 ms of MFA (89% and 92%). Its wall-clock word-emission latency on the CPU is 293 ms (median) / 479 ms (P95) in English (56 ms compute per 160 ms hop) and 511 / 866 ms in Turkish with the larger MMS aligner, or 250 / 520 ms on a GPU. The LVD values in Table 6 must be read with the caveat of Table 4, amplified here: the oracle shares TSYNC's viseme representation</w:t>
       </w:r>
       <w:r>
         <w:t xml:space="preserve"> </w:t>
@@ -6588,7 +6596,7 @@
         <w:pStyle w:val="BodyText"/>
       </w:pPr>
       <w:r>
-        <w:t xml:space="preserve">LVD in Section V-C measures proximity to an oracle that shares TSYNC's viseme table and kernel. To test the conditions against real articulation, we use GRID [54] video. For a random subset of the held-out speakers s29–s34 (100 utterances per speaker, seed 0; 593 utterances after face-detection filtering), 14-channel ARKit blendshape trajectories were extracted from the video frames with MediaPipe FaceLandmarker [55] (25 fps, linearly resampled to 60 fps). All conditions were run on the video's own audio track, which is synchronous with the frames (the separately distributed GRID audio is silence-trimmed and offset from the video; Section V-E). The generators are the same as in Section V-C, with three additions. TSYNC is run with both the tiny and the small recognizer. Two learned CPU baselines are added: LEARNED-sync, the causal Transformer of Section V-G re-trained on synchronous GRID audio with video-measured labels (in-domain: trained on speakers s1–s28 of the same corpus), and LEARNED, the originally released checkpoint trained on offset audio. Finally, NVIDIA Audio2Face-3D [15] (regression model v2.3, actor Mark, official open weights) is added as the state-of-the-art open learned model; it was not trained on GRID. Because the official SDK requires TensorRT, we run the released ONNX network with ONNX Runtime on the CPU and port the SDK's skin post-processing (PCA reconstruction, face mask, upper/lower-face smoothing and strengths) and its regularized, bounded blendshape solve to the 52 ARKit poses to Python; eye blinks, tongue and emotion inference are omitted, and the bounded least-squares problem is solved exactly rather than with the SDK's iterative solver. MFA here has oracle timing but is scored like any other condition.</w:t>
+        <w:t xml:space="preserve">LVD in Section V-C measures proximity to an oracle that shares TSYNC's viseme table and kernel. To test the conditions against real articulation, we use GRID [54] video. For a random subset of the held-out speakers s29–s34 (100 utterances per speaker, seed 0; 593 utterances after face-detection filtering), 14-channel ARKit blendshape trajectories were extracted from the video frames with MediaPipe FaceLandmarker [55] (25 fps, linearly resampled to 60 fps). All conditions were run on the video's own audio track, which is synchronous with the frames (the separately distributed GRID audio is silence-trimmed and offset from the video; Section V-E). The generators are the same as in Section V-C, with three additions. TSYNC is run with both the tiny and the small recognizer. LEARNED (Section V-A), the released checkpoint trained on offset audio, is complemented by LEARNED-sync, the causal Transformer of Section V-G re-trained on synchronous GRID audio with video-measured labels (in-domain: trained on speakers s1–s28 of the same corpus). Finally, NVIDIA Audio2Face-3D [15] (regression model v2.3, actor Mark, official open weights) is added as the state-of-the-art open learned model; it was not trained on GRID. Because the official SDK requires TensorRT, we run the released ONNX network with ONNX Runtime on the CPU and port to Python the SDK's skin post-processing (PCA reconstruction, face mask, upper/lower-face smoothing and strengths) and its regularized, bounded solve for the 52 ARKit blendshape weights; eye blinks, tongue and emotion inference are omitted, and the bounded least-squares problem is solved exactly rather than with the SDK's iterative solver. MFA here has oracle timing but is scored like any other condition.</w:t>
       </w:r>
     </w:p>
     <w:p>
@@ -6596,7 +6604,7 @@
         <w:pStyle w:val="BodyText"/>
       </w:pPr>
       <w:r>
-        <w:t xml:space="preserve">The MediaPipe blendshape scale differs from the hand-designed viseme table, so each condition's output is mapped to the video scale by a per-channel affine calibration (non-negative gain) fitted leave-one-speaker-out: the calibration applied to a speaker is always fitted on the other five. We report the per-frame L2 distance in the 14-channel blendshape space after calibration (LVD_bs), the same distance as lip-vertex displacement on the evaluation mesh (LVD_mesh), per-channel Pearson correlation with the video trajectory (scale-free, no calibration) and the lag of the JawOpen cross-correlation with the video jawOpen (positive = prediction late). Two diagnostic variants isolate the layers:</w:t>
+        <w:t xml:space="preserve">The MediaPipe blendshape scale differs from the hand-designed viseme table, so each condition's output is mapped to the video scale by a per-channel affine calibration (non-negative gain) fitted leave-one-speaker-out: the calibration applied to a speaker is always fitted on the other five. We report the per-frame L2 distance in the 14-channel blendshape space after calibration (LVD_bs), the L2 lip-vertex distance on the evaluation mesh after driving it with the calibrated trajectories (LVD_mesh), per-channel Pearson correlation with the video trajectory (scale-free, no calibration) and the lag of the JawOpen cross-correlation with the video jawOpen (positive = prediction late). Two diagnostic variants isolate the layers:</w:t>
       </w:r>
       <w:r>
         <w:t xml:space="preserve"> </w:t>
@@ -6663,7 +6671,7 @@
         <w:t xml:space="preserve"> </w:t>
       </w:r>
       <w:r>
-        <w:t xml:space="preserve">Agreement with video-measured articulation, GRID held-out speakers s29–s34 (n = 593 utterances). LVD_bs: mean [bootstrap 95% CI]. r: mean per-utterance Pearson correlation. Lag: median (mean ± SD), ms. TSYNC variants use the small recognizer unless marked tiny. For AMP only JawOpen varies, so its 14-channel mean correlation equals its JawOpen correlation and MouthClose is undefined.</w:t>
+        <w:t xml:space="preserve">Agreement with video-measured articulation, GRID held-out speakers s29–s34 (n = 593 utterances). LVD_bs: mean [bootstrap 95% CI]. r: mean per-utterance Pearson correlation. Lag: median (mean ± SD), ms. TSYNC variants use the small recognizer unless marked tiny. For AMP only JawOpen varies, so its 14-channel mean correlation equals its JawOpen correlation and MouthClose is undefined. Paired differences are computed from unrounded per-utterance values.</w:t>
       </w:r>
     </w:p>
     <w:tbl>
@@ -7294,6 +7302,8 @@
             </w:pPr>
             <w:r>
               <w:rPr>
+                <w:b/>
+                <w:bCs/>
                 <w:sz w:val="16"/>
               </w:rPr>
               <w:t xml:space="preserve">0.588</w:t>
@@ -8580,7 +8590,7 @@
         <w:t xml:space="preserve"> </w:t>
       </w:r>
       <w:r>
-        <w:t xml:space="preserve">Agreement with video-measured articulation (Table 7). (a) LVD_bs after leave-one-speaker-out calibration, mean with between-utterance bootstrap 95% CI; the axis is truncated at 0.25, and the paired contrasts in the text are the relevant comparison. (b) Mean JawOpen correlation with the video trajectory. With its own streaming recognizer, TSYNC falls behind AMP and RATE; with streaming alignment of the known transcript (TSYNC-CTC) it overtakes both and approaches the reference-boundary variant (TSYNC-refwords) and Audio2Face-3D.</w:t>
+        <w:t xml:space="preserve">Agreement with video-measured articulation (Table 7). (a) LVD_bs after leave-one-speaker-out calibration, mean with between-utterance bootstrap 95% CI; the axis is truncated at 0.25, and the paired contrasts in the text are the relevant comparison. (b) Mean JawOpen correlation with the video trajectory. With its own streaming recognizer, TSYNC falls behind AMP and RATE; with streaming alignment of the known transcript (TSYNC-CTC) it overtakes both in blendshape distance and JawOpen correlation and approaches the reference-boundary variant (TSYNC-refwords) and Audio2Face-3D.</w:t>
       </w:r>
     </w:p>
     <w:p>
@@ -8612,7 +8622,7 @@
         <w:t xml:space="preserve"> </w:t>
       </w:r>
       <w:r>
-        <w:t xml:space="preserve">AMP (0.2673) and RATE (0.2684) are closer to the video than TSYNC with the small recognizer (0.2716; paired Wilcoxon, Holm-corrected, p &lt; 10⁻¹⁹ for both) or the tiny recognizer (0.2695). The differences are small, about 1.6% of LVD_bs, but consistent. The within-representation advantage of Table 4 therefore does not transfer to measured articulation.</w:t>
+        <w:t xml:space="preserve">AMP (0.2673) and RATE (0.2684) are closer to the video than TSYNC with the small recognizer (0.2716; paired Wilcoxon, Holm-corrected, p &lt; 10⁻¹⁹ for both) or the tiny recognizer (0.2695). The differences are small, about 1.2–1.6% of LVD_bs, but consistent. The within-representation advantage of Table 4 therefore does not transfer to measured articulation.</w:t>
       </w:r>
     </w:p>
     <w:p>
@@ -8660,7 +8670,7 @@
         <w:t xml:space="preserve"> </w:t>
       </w:r>
       <w:r>
-        <w:t xml:space="preserve">Audio2Face-3D (0.2628) is statistically indistinguishable from the MFA oracle (ΔLVD_bs = +0.0007 [−0.0004, +0.0017], p = 0.10) and from TSYNC-refwords (p = 0.20), is clearly closer to the video than AMP, RATE and TSYNC (TSYNC − A2F: +0.0088 [+0.0076, +0.0101], p &lt; 10⁻³⁶), and has the lowest mesh distance and the highest JawOpen correlation of all conditions. The small in-domain LEARNED-sync model matches AMP on LVD_bs and has the second-lowest mesh distance. The premise that learned audio-driven animation is out of reach on a CPU budget therefore does not hold for this open model: our CPU port runs a 30 fps frame in about 20 ms (Section V-F). What TranscriptionSync retains is narrower: a training-free, interpretable pipeline whose Layers 2–3 reach the accuracy of Audio2Face-3D when word timing is accurate, at 0.3% of one CPU core against roughly 60% for our Audio2Face-3D port. The saving is real only if word timing is available at no cost (for example, from an API that returns word timestamps); with its own streaming recognizer, Layer 1 occupies a full core and TSYNC is neither cheaper nor more accurate than Audio2Face-3D.</w:t>
+        <w:t xml:space="preserve">Audio2Face-3D (0.2628) is statistically indistinguishable from the MFA oracle (ΔLVD_bs = +0.0007 [−0.0004, +0.0017], p = 0.10) and from TSYNC-refwords (p = 0.20), is clearly closer to the video than AMP, RATE and TSYNC (TSYNC − A2F: +0.0088 [+0.0076, +0.0101], p &lt; 10⁻³⁶), has the lowest mesh distance of all conditions and shares the highest JawOpen correlation (0.588) with LEARNED-sync. The small in-domain LEARNED-sync model matches AMP on LVD_bs, has the second-lowest mesh distance and has the highest 14-channel mean correlation (0.227). A common premise, that learned audio-driven animation is out of reach on a CPU budget, therefore does not hold for this open model: our CPU port runs a 30 fps frame in about 20 ms (Section V-F). What TranscriptionSync retains is narrower: a training-free, interpretable pipeline whose Layers 2–3 reach the accuracy of Audio2Face-3D when word timing is accurate, at 0.3% of one CPU core against roughly 60% for our Audio2Face-3D port. The saving is real only if word timing is available at no cost (for example, from an API that returns word timestamps); with its own streaming recognizer, Layer 1 occupies a full core and TSYNC is neither cheaper nor more accurate than Audio2Face-3D. With the alignment variant, Layer 1 uses about 28–35% of a core (45–56 ms per 160 ms hop), roughly half the load of our Audio2Face-3D port.</w:t>
       </w:r>
     </w:p>
     <w:p>
@@ -8702,7 +8712,7 @@
           <w:i/>
           <w:iCs/>
         </w:rPr>
-        <w:t xml:space="preserve">co-articulation helps against real articulation as well, duration weights do not.</w:t>
+        <w:t xml:space="preserve">co-articulation helps against real articulation as well; duration weights do not.</w:t>
       </w:r>
       <w:r>
         <w:t xml:space="preserve"> </w:t>
@@ -8744,7 +8754,7 @@
           <w:b/>
           <w:bCs/>
         </w:rPr>
-        <w:t xml:space="preserve">Signed timing on GRID (D3/D4).</w:t>
+        <w:t xml:space="preserve">Signed timing on GRID.</w:t>
       </w:r>
       <w:r>
         <w:t xml:space="preserve"> </w:t>
@@ -8770,7 +8780,7 @@
         <w:pStyle w:val="BodyText"/>
       </w:pPr>
       <w:r>
-        <w:t xml:space="preserve">The end-to-end metrics above combine errors from all three layers. Layers 1 and 2 can be validated separately on the GRID audiovisual sentence corpus [54], which contains 1 000 read sentences from each of 34 speakers. Forced alignment (MFA [11]) of the studio-quality audio, where aligners operate near their ceiling, provides word- and phoneme-level reference timing. We use MFA rather than the corpus-distributed .align files as the reference, because the two are not on the same clock as the audio we align. The .align files are timed against the original, untrimmed recordings, whose audio is also the sound track of the GRID videos. The separately distributed 25 kHz audio edition is silence-trimmed: cross-correlating it with the video sound track (n = 177 utterances, normalized peak 0.975) shows that each file starts a mean 432 ms (SD 146 ms) into the original recording, which matches the mean .align onset of the first word (441 ms). This explains the offset of about −362 ms between the trimmed audio and the .align entries observed in our pipeline; it is an edition mismatch, not a timing error in the corpus or a unit-conversion error. In addition, in the Zenodo distribution of the corpus, 22 of the 34 speaker folders of alignments.zip hold another speaker's alignments (pairwise swaps such as s28↔s29 and s32↔s33, and a four-speaker cycle s10–s13); utterance identifiers must therefore be matched across folders. All timing references in this section come from MFA run on the trimmed audio, which is self-consistent.</w:t>
+        <w:t xml:space="preserve">The end-to-end metrics above combine errors from all three layers. Layers 1 and 2 can be validated separately on the GRID audiovisual sentence corpus [54], which contains 1 000 read sentences from each of 34 speakers. Forced alignment (MFA [11]) of the studio-quality audio, where aligners operate near their ceiling, provides word- and phoneme-level reference timing. We use MFA rather than the corpus-distributed .align files as the reference, because the two are not on the same clock as the audio we align. The .align files are timed against the original, untrimmed recordings, whose audio is also the sound track of the GRID videos. The separately distributed 25 kHz audio edition is silence-trimmed: cross-correlating it with the video sound track (n = 177 utterances, normalized peak 0.975) shows that each file starts a mean 432 ms (SD 146 ms) into the original recording, which matches the mean .align onset of the first word (441 ms). This accounts for most of the offset of about −362 ms between the trimmed audio and the .align entries observed in our pipeline (the remainder reflects the difference between the energy-based onset and the first .align word boundary); it is an edition mismatch, not a timing error in the corpus or a unit-conversion error. In addition, in the Zenodo distribution of the corpus, 22 of the 34 speaker folders of alignments.zip hold another speaker's alignments (pairwise swaps such as s28↔s29 and s32↔s33, and a four-speaker cycle s10–s13); utterance identifiers must therefore be matched across folders. All timing references in this section come from MFA run on the trimmed audio, which is self-consistent.</w:t>
       </w:r>
     </w:p>
     <w:p>
@@ -9436,7 +9446,7 @@
         <w:t xml:space="preserve"> </w:t>
       </w:r>
       <w:r>
-        <w:t xml:space="preserve">Composition with ASR boundaries raises the error from 18 to 65 ms, closely tracking the word-start MAE (69 ms). A 65 ms error exceeds the +45 ms bound if visemes lag the audio but lies within the −125 ms bound if they lead it, so its perceptual relevance depends on the sign distribution. On the untrimmed GRID audio of Section V-D, word starts of the small recognizer are predominantly early (median −100 ms without and −70 ms with onset correction), that is, on the tolerant side; the tiny recognizer is late by a median 40 ms. Because the error is bounded per word and does not accumulate (Section IV-C), it appears as transient per-word offsets rather than progressive drift.</w:t>
+        <w:t xml:space="preserve">Composition with ASR boundaries raises the error from 18 to 65 ms, closely tracking the word-start MAE (69 ms). A 65 ms error exceeds the +45 ms bound if visemes lag the audio but lies within the −125 ms bound if they lead it, so its perceptual relevance depends on the sign distribution. Table 8 uses the tiny recognizer, which on the untrimmed GRID audio of Section V-D is late by a median 40 ms, that is, on the less tolerant side; word starts of the small recognizer are instead predominantly early (median −100 ms without and −70 ms with onset correction). Because the error is bounded per word and does not accumulate (Section IV-C), it appears as transient per-word offsets rather than progressive drift.</w:t>
       </w:r>
     </w:p>
     <w:p>
@@ -9524,7 +9534,7 @@
         <w:t xml:space="preserve"> </w:t>
       </w:r>
       <w:r>
-        <w:t xml:space="preserve">A straightforward benchmark (tools/layer1_bench.py) reports a word-emission lag of P95 = 214 ms for English. It starts its wall clock at zero when the first window, which ends at stream time W = 3.2 s, is submitted, so the time needed for the first 3.2 s of audio to arrive is never counted, and negative lags are clipped to zero; the reported median of 0 ms is a direct symptom. We therefore re-measure L as defined in Section IV-B: audio arrives in real time, a window can be processed only after its audio has arrived and the previous window has finished, a window whose compute exceeds the hop is followed by the most recent audio (skip-ahead), and L is the wall-clock time from a word's end to its emission (layer1_wall.py). We report the as-designed protocol (first window after W) and a variant whose window grows from the first hop. The material is the paper's espeak-ng sentences and, as natural speech, 20 FLEURS test utterances per language [53] (English mean 10.0 s, Turkish 12.8 s).</w:t>
+        <w:t xml:space="preserve">A straightforward benchmark (tools/layer1_bench.py) reports a word-emission lag of P95 = 214 ms for English (0.27–0.30 s when rerun on our hardware; Table 9, "Original clock"). It starts its wall clock at zero when the first window, which ends at stream time W = 3.2 s, is submitted, so the time needed for the first 3.2 s of audio to arrive is never counted, and negative lags are clipped to zero; the reported median of 0 ms is a direct symptom. We therefore re-measure L as defined in Section IV-B: audio arrives in real time, a window can be processed only after its audio has arrived and the previous window has finished, a window whose compute exceeds the hop is followed by the most recent audio (skip-ahead), and L is the wall-clock time from a word's end to its emission (layer1_wall.py). We report the as-designed protocol (first window after W) and a variant whose window grows from the first hop. The material is the 10 espeak-ng-synthesized sentences of the Layers 2–3 benchmark (5 English, 5 Turkish) and, as natural speech, 20 FLEURS test utterances per language [53] (English mean 10.0 s, Turkish 12.8 s).</w:t>
       </w:r>
     </w:p>
     <w:p>
@@ -10684,7 +10694,7 @@
         <w:t xml:space="preserve"> </w:t>
       </w:r>
       <w:r>
-        <w:t xml:space="preserve">Layer-1 word-emission latency on natural speech (FLEURS), median and P95, under the original benchmark clock and under wall-clock measurement (Table 9). The original clock reports sub-300 ms P95 values for English regardless of model size; measured in wall-clock time, the P95 is about 3.4 s.</w:t>
+        <w:t xml:space="preserve">Layer-1 word-emission latency on natural speech (FLEURS), median and P95, under the original benchmark clock and under wall-clock measurement (Table 9). The original clock reports sub-300 ms P95 values on English for the tiny and base models; measured in wall-clock time, their P95 is about 3.4 s (small: 2.9 s and 5.6 s).</w:t>
       </w:r>
     </w:p>
     <w:p>
@@ -10702,10 +10712,10 @@
           <w:i/>
           <w:iCs/>
         </w:rPr>
-        <w:t xml:space="preserve">the playout buffer required by Eq. (3) is about 3.4 s, not 215 ms</w:t>
-      </w:r>
-      <w:r>
-        <w:t xml:space="preserve">: with the tiny model on natural English speech, L has a median of 1.33 s and a P95 of 3.37 s; starting with a growing window lowers the median to 0.93 s but not the P95 (3.22 s). The P95 is dominated by the window/guard finalization policy, under which the last words of a window are withheld until later windows confirm them, rather than by compute. A 3 s response delay is incompatible with conversational turn-taking, so Layer 1 in its present form is not deployable live; a finalization policy based on agreement between consecutive hypotheses [48] and a streaming aligner are the obvious next steps. Second,</w:t>
+        <w:t xml:space="preserve">the playout buffer required by Eq. (3) is about 3.4 s, not the ≈ 215 ms implied by the original benchmark</w:t>
+      </w:r>
+      <w:r>
+        <w:t xml:space="preserve">: with the tiny model on natural English speech, L has a median of 1.33 s and a P95 of 3.37 s; starting with a growing window lowers the median to 0.93 s but not the P95 (3.22 s). The P95 is dominated by the window/guard finalization policy, under which the last words of a window are withheld until later windows confirm them, rather than by compute. A 3 s response delay is incompatible with conversational turn-taking, so the recognition variant of Layer 1 is not deployable live; finalization based on agreement between consecutive hypotheses [48] does not fix this, whereas streaming alignment does (below). Second,</w:t>
       </w:r>
       <w:r>
         <w:t xml:space="preserve"> </w:t>
@@ -10718,7 +10728,7 @@
         <w:t xml:space="preserve">larger models do not help</w:t>
       </w:r>
       <w:r>
-        <w:t xml:space="preserve">: base has the same latency as tiny, and small is markedly slower (P95 5.6 s), because its per-window compute exceeds the hop. Third,</w:t>
+        <w:t xml:space="preserve">: base has the same latency as tiny, and small is markedly slower (P95 5.6 s), because its per-window compute (1 134 ms) exceeds the hop more than threefold. On English, tiny (373–500 ms) and base (420 ms) also exceed the 320 ms hop and keep up only through skip-ahead. Third,</w:t>
       </w:r>
       <w:r>
         <w:t xml:space="preserve"> </w:t>
@@ -10749,7 +10759,7 @@
         <w:t xml:space="preserve"> </w:t>
       </w:r>
       <w:r>
-        <w:t xml:space="preserve">Table 10 reports the same wall-clock measurement for the alignment variant, together with LocalAgreement-2 finalization [48] as an alternative recognition policy. LocalAgreement does not help on this hardware (tiny model, median 1.41 s, P95 3.29 s, and only about 70% of words committed exactly). Streaming CTC alignment of the transcript does: with wav2vec2-base on the CPU, the per-hop compute is about 45 ms, the aligner keeps up with a 160 ms hop, and the word-emission latency has a median of 307 ms and a P95 of 677 ms on FLEURS English (316 / 556 ms on GRID); the pause rule lowers the P95 from 981 ms. Accuracy is unchanged by streaming: 82% of word starts fall within 100 ms of MFA (median error 60 ms), against 84% for offline alignment with the same model and 53% for LocalAgreement. For Turkish, the multilingual MMS aligner is slower on the CPU (160 ms per 320 ms hop; median 555 ms, P95 1.19 s) and real-time with a large margin on a laptop GPU (11 ms per hop; median 274 ms, P95 766 ms). Against MFA with its Turkish acoustic model, 93% of Turkish word starts fall within 100 ms (median error 30 ms, MAE 46 ms), on both devices.</w:t>
+        <w:t xml:space="preserve">Table 10 reports the same wall-clock measurement for the alignment variant, together with LocalAgreement-2 finalization [48] as an alternative recognition policy. LocalAgreement does not help on this hardware (tiny model, median 1.41 s, P95 3.29 s, and only about 70% of words committed exactly). Streaming CTC alignment of the transcript does: with wav2vec2-base on the CPU, the per-hop compute is about 45 ms, the aligner keeps up with a 160 ms hop, and the word-emission latency has a median of 307 ms and a P95 of 677 ms on FLEURS English (316 / 556 ms on GRID); the pause rule lowers the P95 from 981 ms. Accuracy is essentially unchanged by streaming: 82% of word starts fall within 100 ms of MFA (median error 60 ms), against 84% for offline alignment with the same model and 53% for LocalAgreement. For Turkish, the multilingual MMS aligner is slower on the CPU (160 ms per 320 ms hop; median 555 ms, P95 1.19 s) and real-time with a large margin on a laptop GPU (11 ms per hop; median 274 ms, P95 766 ms). Against MFA with its Turkish acoustic model, 93% of Turkish word starts fall within 100 ms (median error 30 ms, MAE 46 ms), on both devices.</w:t>
       </w:r>
     </w:p>
     <w:p>
@@ -11864,7 +11874,7 @@
         <w:t xml:space="preserve"> </w:t>
       </w:r>
       <w:r>
-        <w:t xml:space="preserve">Audio2Face-3D needs audio up to 260 ms after the frame it predicts (buffer_len − buffer_ofs = 4 160 samples at 16 kHz), which fixes its algorithmic latency. Our CPU port (ONNX Runtime, 4 threads) takes 15.3 ms (median) / 17.2 ms (P95) per 30 fps frame for the network and about 19.8 ms including post-processing and the blendshape solve, which is real-time on the CPU but occupies roughly 60% of a core. The LEARNED-sync causal Transformer takes 0.26 ms (median) / 0.46 ms (P95) per 60 fps frame on one thread when an utterance is processed at once; frame-by-frame streaming with a growing causal context would cost more and was not measured. RATE has no algorithmic latency: in the live system its transcript arrives a mean 349 ms before the audio.</w:t>
+        <w:t xml:space="preserve">Audio2Face-3D needs audio up to 260 ms after the frame it predicts (buffer_len − buffer_ofs = 4 160 samples at 16 kHz), which fixes its algorithmic latency. Our CPU port (ONNX Runtime, 4 threads) takes 15.3 ms (median) / 17.2 ms (P95) per 30 fps frame for the network and about 19.8 ms including post-processing and the blendshape solve, which is real-time on the CPU but occupies roughly 60% of a core. The LEARNED-sync causal Transformer takes 0.26 ms (median) / 0.46 ms (P95) per 60 fps frame on one thread when an utterance is processed at once; frame-by-frame streaming with a growing causal context would cost more and was not measured. RATE has no algorithmic latency: in the live system its transcript arrives a mean 690 ms before the audio (n = 50, Section V-C).</w:t>
       </w:r>
     </w:p>
     <w:p>
@@ -12212,7 +12222,7 @@
         <w:t xml:space="preserve"> </w:t>
       </w:r>
       <w:r>
-        <w:t xml:space="preserve">Audio-to-blendshape regression on held-out speakers (s29–s34, n = 593), synchronous audio, mean ± SD over 3 seeds. Lag: mean per-utterance JawOpen cross-correlation lag ± its SD across utterances (averaged over seeds). Vel. ratio: predicted / reference frame-to-frame motion magnitude (1.0 = matching dynamics).</w:t>
+        <w:t xml:space="preserve">Audio-to-blendshape regression on held-out speakers (s29–s34, n = 593), synchronous audio, mean ± SD over 3 seeds. Lag: mean per-utterance JawOpen cross-correlation lag ± its SD across utterances (averaged over seeds). Vel. ratio: predicted / reference frame-to-frame motion magnitude (1.0 = matching dynamics). BS-L2: per-frame L2 distance in the 14-channel blendshape space.</w:t>
       </w:r>
     </w:p>
     <w:tbl>
@@ -12346,7 +12356,7 @@
                 <w:bCs/>
                 <w:sz w:val="16"/>
               </w:rPr>
-              <w:t xml:space="preserve">LVD μ</w:t>
+              <w:t xml:space="preserve">BS-L2 μ</w:t>
             </w:r>
           </w:p>
         </w:tc>
@@ -12367,7 +12377,7 @@
                 <w:bCs/>
                 <w:sz w:val="16"/>
               </w:rPr>
-              <w:t xml:space="preserve">LVD p95</w:t>
+              <w:t xml:space="preserve">BS-L2 p95</w:t>
             </w:r>
           </w:p>
         </w:tc>
@@ -13063,7 +13073,7 @@
         <w:t xml:space="preserve"> </w:t>
       </w:r>
       <w:r>
-        <w:t xml:space="preserve">Re-trained regressors (Table 11), mean ± SD over three seeds. Left: LVD μ in blendshape space. Middle: mean JawOpen lag. Right: velocity ratio; the dashed line marks dynamics that match the reference.</w:t>
+        <w:t xml:space="preserve">Re-trained regressors (Table 11), mean ± SD over three seeds. Left: BS-L2 μ (L2 distance in blendshape space). Middle: mean JawOpen lag. Right: velocity ratio; the dashed line marks dynamics that match the reference.</w:t>
       </w:r>
     </w:p>
     <w:p>
@@ -13162,7 +13172,7 @@
         <w:t xml:space="preserve"> </w:t>
       </w:r>
       <w:r>
-        <w:t xml:space="preserve">Compared with the offset run (Transformer, rule-derived labels: Val MSE 0.0075, LVD p95 0.603, lag 81 ± 137 ms, velocity ratio 0.42), the re-run reaches lower error (0.0048, 0.520), zero mean lag (−5 ± 94 ms) and reference-level dynamics (1.01) with about a tenth of the training data. The low velocity ratios of the offset run were mostly a consequence of the offset, which forces an MSE-trained model to average over uncertain timing.</w:t>
+        <w:t xml:space="preserve">Compared with the offset run (Transformer, rule-derived labels: Val MSE 0.0075, BS-L2 p95 0.603, lag 81 ± 137 ms, velocity ratio 0.42), the re-run reaches lower error (0.0048, 0.520), zero mean lag (−5 ± 94 ms) and reference-level dynamics (1.01) with about a tenth of the training data. The low velocity ratios of the offset run were mostly a consequence of the offset, which forces an MSE-trained model to average over uncertain timing.</w:t>
       </w:r>
     </w:p>
     <w:p>
@@ -13186,7 +13196,7 @@
         <w:t xml:space="preserve"> </w:t>
       </w:r>
       <w:r>
-        <w:t xml:space="preserve">(LVD μ 0.150 vs 0.201), as expected for deterministic labels that a bidirectional model can reconstruct from both past and future context.</w:t>
+        <w:t xml:space="preserve">(BS-L2 μ 0.150 vs 0.201), as expected for deterministic labels that a bidirectional model can reconstruct from both past and future context.</w:t>
       </w:r>
     </w:p>
     <w:p>
@@ -13210,7 +13220,7 @@
         <w:t xml:space="preserve"> </w:t>
       </w:r>
       <w:r>
-        <w:t xml:space="preserve">Both architectures reach the same error (LVD μ 0.264 vs 0.263), but the BiLSTM collapses toward over-smoothed output (velocity ratio 0.42 ± 0.06) whereas the causal Transformer preserves the reference dynamics (0.96 ± 0.03). This confirms, over three seeds and with synchronous audio, the architectural observation of the offset run, and supports a causal Transformer as the backbone for a learned Layer 3.</w:t>
+        <w:t xml:space="preserve">Both architectures reach the same error (BS-L2 μ 0.264 vs 0.263), but the BiLSTM collapses toward over-smoothed output (velocity ratio 0.42 ± 0.06) whereas the causal Transformer preserves the reference dynamics (0.96 ± 0.03). This confirms, over three seeds and with synchronous audio, the architectural observation of the offset run, and supports a causal Transformer as the backbone for a learned Layer 3.</w:t>
       </w:r>
     </w:p>
     <w:p>
@@ -13287,7 +13297,7 @@
         <w:t xml:space="preserve"> </w:t>
       </w:r>
       <w:r>
-        <w:t xml:space="preserve">A compact streaming recognizer loses the advantage through word-timing error, recognition errors and, above all, latency: with sliding-window finalization, the word-emission P95 is about 3.4 s on natural speech, and on GRID the full pipeline falls behind simple baselines. Aligning the transcript that the API already provides, instead of recognizing the words again, removes both problems: latency drops to a P95 of 0.56–0.68 s on a CPU and the pipeline becomes more accurate than amplitude-only and rate-scheduled animation.</w:t>
+        <w:t xml:space="preserve">With a compact streaming recognizer, word-timing and recognition errors cost the accuracy advantage (on GRID the full pipeline falls behind simple baselines), and latency rules out live use (with sliding-window finalization, the word-emission P95 is about 3.4 s on natural speech). Aligning the transcript that the API already provides, instead of recognizing the words again, removes both problems: latency drops to a P95 of 0.56–0.68 s for English on a CPU and the pipeline becomes more accurate than amplitude-only and rate-scheduled animation in blendshape distance and JawOpen correlation.</w:t>
       </w:r>
     </w:p>
     <w:p>
@@ -13295,7 +13305,7 @@
         <w:pStyle w:val="BodyText"/>
       </w:pPr>
       <w:r>
-        <w:t xml:space="preserve">For practitioners this yields a clear recommendation. Audio2Face-3D remains the most accurate option we tested and has the lowest latency (a fixed 260 ms look-ahead, real-time on one CPU core in our port). TranscriptionSync with streaming alignment is the training-free alternative: it needs the API transcription, adds about 0.4 s more latency than Audio2Face-3D, is slightly less accurate, costs about 45 ms per 160 ms hop plus negligible synthesis, and remains fully interpretable; its Layers 2–3 can be reused unchanged with any source of word timing, including word timestamps returned directly by an API. The deployed RATE variant remains a zero-latency fallback: on GRID it is close to amplitude-only motion in distance (0.2684 vs. 0.2673) and slightly behind it in JawOpen correlation, but it adds rounding, spreading and closure channels that amplitude-only motion lacks.</w:t>
+        <w:t xml:space="preserve">For practitioners this yields a clear recommendation. Audio2Face-3D remains the most accurate option we tested and has the lowest latency (a fixed 260 ms look-ahead, real-time on one CPU core in our port). TranscriptionSync with streaming alignment is the training-free alternative: it needs the API transcription, adds about 0.4 s more latency than Audio2Face-3D, is slightly less accurate, costs 45–56 ms per 160 ms hop plus negligible synthesis, and remains fully interpretable; its Layers 2–3 can be reused unchanged with any source of word timing, including word timestamps returned directly by an API. The deployed RATE variant remains a zero-latency fallback: on GRID it is close to amplitude-only motion in distance (0.2684 vs. 0.2673) and clearly behind it in JawOpen correlation (0.412 vs. 0.525), but it adds rounding, spreading and closure channels that amplitude-only motion lacks.</w:t>
       </w:r>
     </w:p>
     <w:p>
@@ -13333,7 +13343,7 @@
         <w:t xml:space="preserve"> </w:t>
       </w:r>
       <w:r>
-        <w:t xml:space="preserve">The video-measured evaluation uses GRID, a read corpus with a 51-word grammar; recognition is harder there than in conversational speech (only 52–58% of words matched exactly), which penalizes Layer 1 more than it would on natural speech. The live-system recordings of Section V-C (one synthetic voice, English, 50 utterances) are not part of the released material, so the analyses of Sections V-D to V-F could not be repeated on them.</w:t>
+        <w:t xml:space="preserve">The video-measured evaluation uses GRID, a read corpus with a 51-word grammar; recognition is harder there than in conversational speech (only 52–58% of words matched exactly), which penalizes Layer 1 more than it would on natural speech. The live-system material of Section V-C has no video ground truth, so the validation against measured articulation (Section V-D) rests on GRID alone; the re-collected set (50 English and 25 Turkish responses, Table 6) repeats the metrics of Table 4 with Audio2Face-3D, TSYNC-CTC and logged text timing, but the original 50 recordings could not be re-analyzed.</w:t>
       </w:r>
     </w:p>
     <w:p>
@@ -13387,7 +13397,7 @@
         <w:t xml:space="preserve"> </w:t>
       </w:r>
       <w:r>
-        <w:t xml:space="preserve">Layer-1 latency was measured with a simulator that reproduces real-time audio arrival, text arrival and window scheduling from logged Live API sessions on a shared machine; end-to-end voice-to-voice latency under the Gemini Live integration, including the playout buffer and the emotion hold-back of Section III-D, remains unmeasured. The LEARNED-sync compute figure assumes whole-utterance processing.</w:t>
+        <w:t xml:space="preserve">Layer-1 latency was measured on a shared machine with a simulator that reproduces real-time audio arrival, text arrival and window scheduling. Only the live latency figures of Section V-C (Table 6 material) replay logged Live API sessions; Tables 9 and 10 use FLEURS, GRID and espeak-ng audio. The alignment variant has not yet been run inside the assistant, which currently ships RATE. End-to-end voice-to-voice latency under the Gemini Live integration, including the playout buffer and the emotion hold-back of Section III-D, remains unmeasured. The LEARNED-sync compute figure assumes whole-utterance processing.</w:t>
       </w:r>
     </w:p>
     <w:p>
@@ -13459,7 +13469,7 @@
         <w:pStyle w:val="BodyText"/>
       </w:pPr>
       <w:r>
-        <w:t xml:space="preserve">TranscriptionSync places the words of a native-audio LLM's response on the audio clock, distributes them over phonemes and synthesizes co-articulated ARKit mouth blendshapes without any training. Evaluated against articulation measured from video, its Layers 2–3 match the learned state of the art when word boundaries are accurate. How those boundaries are obtained decides the outcome: a compact streaming recognizer is too slow (P95 ≈ 3.4 s) and too inaccurate for the pipeline to beat simple baselines, whereas streaming CTC alignment of the transcription the API already streams runs in real time on a CPU with a P95 latency of 0.56–0.68 s and makes the pipeline more accurate than amplitude-only and rate-scheduled animation, close to Audio2Face-3D. The study also corrects three measurement practices that can make such systems look better than they are (an oracle that shares the evaluated representation, SyncNet confidence scores on stylized avatars, and a latency benchmark that omits the window fill time) and documents two pitfalls of the public GRID distribution. The pipeline is integrated into A.T.L.A.S, an embodied desktop assistant built on Gemini 2.5 Flash Native Audio.</w:t>
+        <w:t xml:space="preserve">TranscriptionSync places the words of a native-audio LLM's response on the audio clock, distributes them over phonemes and synthesizes co-articulated ARKit mouth blendshapes without any training. Evaluated against articulation measured from video, its Layers 2–3 match the learned state of the art when word boundaries are accurate. How those boundaries are obtained decides the outcome: a compact streaming recognizer is too slow (P95 ≈ 3.4 s) and too inaccurate for the pipeline to beat simple baselines, whereas streaming CTC alignment of the transcription the API already streams runs in real time on a CPU with a P95 latency of 0.56–0.68 s for English (in replay simulation) and makes the pipeline more accurate than amplitude-only and rate-scheduled animation in blendshape distance and JawOpen correlation, close to Audio2Face-3D in blendshape distance. The study also corrects three measurement practices that can make such systems look better than they are (an oracle that shares the evaluated representation, SyncNet confidence scores on stylized avatars, and a latency benchmark that omits the window fill time) and documents two pitfalls of the public GRID distribution. The pipeline is integrated into A.T.L.A.S, an embodied desktop assistant built on Gemini 2.5 Flash Native Audio, which currently ships the RATE variant by default.</w:t>
       </w:r>
     </w:p>
     <w:p>
@@ -13487,7 +13497,7 @@
         <w:t xml:space="preserve">TODO-H1: make the repository public and add an archived DOI, e.g., Zenodo</w:t>
       </w:r>
       <w:r>
-        <w:t xml:space="preserve">. The TranscriptionSync Layers 1–3 (streaming ASR, G2P and duration estimation, kernel synthesis), the full ARPAbet/Turkish viseme table, the benchmarks (tools/layer1_bench.py, tools/layer23_bench.py, the wall-clock and streaming-alignment simulators layer1_wall.py and layer1_stream.py), the evaluation scripts and the complete A.T.L.A.S source (approximately 14 900 lines of Python and JavaScript) will be released in the same repository</w:t>
+        <w:t xml:space="preserve">. The TranscriptionSync Layers 1–3 (streaming ASR and CTC alignment, G2P and duration estimation, kernel synthesis), the full ARPAbet/Turkish viseme table, the benchmarks (tools/layer1_bench.py, tools/layer23_bench.py, the wall-clock and streaming-alignment simulators layer1_wall.py and layer1_stream.py), the evaluation scripts and the complete A.T.L.A.S source (approximately 14 900 lines of Python and JavaScript) will be released in the same repository</w:t>
       </w:r>
       <w:r>
         <w:t xml:space="preserve"> </w:t>

</xml_diff>

<commit_message>
paper(revision): full-data re-training of the V-G regressors (Table 11)
Co-Authored-By: Claude Opus 5.5 (1M context) <noreply@anthropic.com>
</commit_message>
<xml_diff>
--- a/paper/revision/manuscript/TranscriptionSync_revised.docx
+++ b/paper/revision/manuscript/TranscriptionSync_revised.docx
@@ -6596,7 +6596,7 @@
         <w:pStyle w:val="BodyText"/>
       </w:pPr>
       <w:r>
-        <w:t xml:space="preserve">LVD in Section V-C measures proximity to an oracle that shares TSYNC's viseme table and kernel. To test the conditions against real articulation, we use GRID [54] video. For a random subset of the held-out speakers s29–s34 (100 utterances per speaker, seed 0; 593 utterances after face-detection filtering), 14-channel ARKit blendshape trajectories were extracted from the video frames with MediaPipe FaceLandmarker [55] (25 fps, linearly resampled to 60 fps). All conditions were run on the video's own audio track, which is synchronous with the frames (the separately distributed GRID audio is silence-trimmed and offset from the video; Section V-E). The generators are the same as in Section V-C, with three additions. TSYNC is run with both the tiny and the small recognizer. LEARNED (Section V-A), the released checkpoint trained on offset audio, is complemented by LEARNED-sync, the causal Transformer of Section V-G re-trained on synchronous GRID audio with video-measured labels (in-domain: trained on speakers s1–s28 of the same corpus). Finally, NVIDIA Audio2Face-3D [15] (regression model v2.3, actor Mark, official open weights) is added as the state-of-the-art open learned model; it was not trained on GRID. Because the official SDK requires TensorRT, we run the released ONNX network with ONNX Runtime on the CPU and port to Python the SDK's skin post-processing (PCA reconstruction, face mask, upper/lower-face smoothing and strengths) and its regularized, bounded solve for the 52 ARKit blendshape weights; eye blinks, tongue and emotion inference are omitted, and the bounded least-squares problem is solved exactly rather than with the SDK's iterative solver. MFA here has oracle timing but is scored like any other condition.</w:t>
+        <w:t xml:space="preserve">LVD in Section V-C measures proximity to an oracle that shares TSYNC's viseme table and kernel. To test the conditions against real articulation, we use GRID [54] video. For a random subset of the held-out speakers s29–s34 (100 utterances per speaker, seed 0; 593 utterances after face-detection filtering), 14-channel ARKit blendshape trajectories were extracted from the video frames with MediaPipe FaceLandmarker [55] (25 fps, linearly resampled to 60 fps). All conditions were run on the video's own audio track, which is synchronous with the frames (the separately distributed GRID audio is silence-trimmed and offset from the video; Section V-E). The generators are the same as in Section V-C, with three additions. TSYNC is run with both the tiny and the small recognizer. LEARNED (Section V-A), the released checkpoint trained on offset audio, is complemented by LEARNED-sync, the causal Transformer of Section V-G re-trained on synchronous GRID audio with video-measured labels (preliminary one-tenth run, seed 0; in-domain: trained on speakers s1–s28 of the same corpus). Finally, NVIDIA Audio2Face-3D [15] (regression model v2.3, actor Mark, official open weights) is added as the state-of-the-art open learned model; it was not trained on GRID. Because the official SDK requires TensorRT, we run the released ONNX network with ONNX Runtime on the CPU and port to Python the SDK's skin post-processing (PCA reconstruction, face mask, upper/lower-face smoothing and strengths) and its regularized, bounded solve for the 52 ARKit blendshape weights; eye blinks, tongue and emotion inference are omitted, and the bounded least-squares problem is solved exactly rather than with the SDK's iterative solver. MFA here has oracle timing but is scored like any other condition.</w:t>
       </w:r>
     </w:p>
     <w:p>
@@ -12203,7 +12203,7 @@
         <w:pStyle w:val="BodyText"/>
       </w:pPr>
       <w:r>
-        <w:t xml:space="preserve">A first training run paired both label sources with the silence-trimmed GRID audio edition, while the labels are timed on the untrimmed recordings (Section V-E). Labels were therefore offset from the model input by a mean 432 ms (SD 146 ms) that varied between utterances. We report here only the re-run, in which the model input is the video's own sound track, synchronous with both label sources. To keep the re-run tractable, it uses a random subset of 100 utterances per training speaker (2 700 utterances; s21 has no video) and the 593 held-out utterances of Section V-D (s29–s34). Each configuration is trained with three seeds; everything else (features, architectures, loss, optimizer, early stopping and the evaluation script grid_eval.py) is unchanged.</w:t>
+        <w:t xml:space="preserve">A first training run paired both label sources with the silence-trimmed GRID audio edition, while the labels are timed on the untrimmed recordings (Section V-E). Labels were therefore offset from the model input by a mean 432 ms (SD 146 ms) that varied between utterances. We report here only the re-run, in which the model input is the video's own sound track, synchronous with both label sources. The re-run uses all videos with a face-detection rate of at least 80%: 26 980 training utterances (s1–s28; s21 has no video) and 6 000 held-out utterances (s29–s34). Each configuration is trained with three seeds; everything else (features, architectures, loss, optimizer, early stopping and the evaluation script grid_eval.py) is unchanged. A preliminary re-run on a random tenth of the training data (100 utterances per speaker, evaluated on the 593 utterances of Section V-D) led to the same conclusions.</w:t>
       </w:r>
     </w:p>
     <w:p>
@@ -12222,7 +12222,7 @@
         <w:t xml:space="preserve"> </w:t>
       </w:r>
       <w:r>
-        <w:t xml:space="preserve">Audio-to-blendshape regression on held-out speakers (s29–s34, n = 593), synchronous audio, mean ± SD over 3 seeds. Lag: mean per-utterance JawOpen cross-correlation lag ± its SD across utterances (averaged over seeds). Vel. ratio: predicted / reference frame-to-frame motion magnitude (1.0 = matching dynamics). BS-L2: per-frame L2 distance in the 14-channel blendshape space.</w:t>
+        <w:t xml:space="preserve">Audio-to-blendshape regression on held-out speakers (s29–s34, n = 6 000), synchronous audio, full training set (26 980 utterances), mean ± SD over 3 seeds. Lag: mean per-utterance JawOpen cross-correlation lag ± its SD across utterances (averaged over seeds). Vel. ratio: predicted / reference frame-to-frame motion magnitude (1.0 = matching dynamics). BS-L2: per-frame L2 distance in the 14-channel blendshape space.</w:t>
       </w:r>
     </w:p>
     <w:tbl>
@@ -12475,7 +12475,7 @@
               <w:rPr>
                 <w:sz w:val="16"/>
               </w:rPr>
-              <w:t xml:space="preserve">0.0048 ± 0.0000</w:t>
+              <w:t xml:space="preserve">0.0036 ± 0.0000</w:t>
             </w:r>
           </w:p>
         </w:tc>
@@ -12493,7 +12493,7 @@
               <w:rPr>
                 <w:sz w:val="16"/>
               </w:rPr>
-              <w:t xml:space="preserve">0.0347 ± 0.0002</w:t>
+              <w:t xml:space="preserve">0.0257 ± 0.0003</w:t>
             </w:r>
           </w:p>
         </w:tc>
@@ -12511,7 +12511,7 @@
               <w:rPr>
                 <w:sz w:val="16"/>
               </w:rPr>
-              <w:t xml:space="preserve">0.201 ± 0.001</w:t>
+              <w:t xml:space="preserve">0.159 ± 0.001</w:t>
             </w:r>
           </w:p>
         </w:tc>
@@ -12529,7 +12529,7 @@
               <w:rPr>
                 <w:sz w:val="16"/>
               </w:rPr>
-              <w:t xml:space="preserve">0.520 ± 0.002</w:t>
+              <w:t xml:space="preserve">0.487 ± 0.001</w:t>
             </w:r>
           </w:p>
         </w:tc>
@@ -12547,7 +12547,7 @@
               <w:rPr>
                 <w:sz w:val="16"/>
               </w:rPr>
-              <w:t xml:space="preserve">−5 ± 94</w:t>
+              <w:t xml:space="preserve">−10 ± 89</w:t>
             </w:r>
           </w:p>
         </w:tc>
@@ -12565,7 +12565,7 @@
               <w:rPr>
                 <w:sz w:val="16"/>
               </w:rPr>
-              <w:t xml:space="preserve">1.01 ± 0.01</w:t>
+              <w:t xml:space="preserve">1.07 ± 0.00</w:t>
             </w:r>
           </w:p>
         </w:tc>
@@ -12619,9 +12619,11 @@
             </w:pPr>
             <w:r>
               <w:rPr>
-                <w:sz w:val="16"/>
-              </w:rPr>
-              <w:t xml:space="preserve">0.0031 ± 0.0001</w:t>
+                <w:b/>
+                <w:bCs/>
+                <w:sz w:val="16"/>
+              </w:rPr>
+              <w:t xml:space="preserve">0.0018 ± 0.0000</w:t>
             </w:r>
           </w:p>
         </w:tc>
@@ -12637,9 +12639,11 @@
             </w:pPr>
             <w:r>
               <w:rPr>
-                <w:sz w:val="16"/>
-              </w:rPr>
-              <w:t xml:space="preserve">0.0254 ± 0.0006</w:t>
+                <w:b/>
+                <w:bCs/>
+                <w:sz w:val="16"/>
+              </w:rPr>
+              <w:t xml:space="preserve">0.0146 ± 0.0002</w:t>
             </w:r>
           </w:p>
         </w:tc>
@@ -12655,9 +12659,11 @@
             </w:pPr>
             <w:r>
               <w:rPr>
-                <w:sz w:val="16"/>
-              </w:rPr>
-              <w:t xml:space="preserve">0.150 ± 0.003</w:t>
+                <w:b/>
+                <w:bCs/>
+                <w:sz w:val="16"/>
+              </w:rPr>
+              <w:t xml:space="preserve">0.094 ± 0.001</w:t>
             </w:r>
           </w:p>
         </w:tc>
@@ -12673,9 +12679,11 @@
             </w:pPr>
             <w:r>
               <w:rPr>
-                <w:sz w:val="16"/>
-              </w:rPr>
-              <w:t xml:space="preserve">0.448 ± 0.010</w:t>
+                <w:b/>
+                <w:bCs/>
+                <w:sz w:val="16"/>
+              </w:rPr>
+              <w:t xml:space="preserve">0.354 ± 0.002</w:t>
             </w:r>
           </w:p>
         </w:tc>
@@ -12693,7 +12701,7 @@
               <w:rPr>
                 <w:sz w:val="16"/>
               </w:rPr>
-              <w:t xml:space="preserve">−8 ± 79</w:t>
+              <w:t xml:space="preserve">−8 ± 68</w:t>
             </w:r>
           </w:p>
         </w:tc>
@@ -12711,7 +12719,7 @@
               <w:rPr>
                 <w:sz w:val="16"/>
               </w:rPr>
-              <w:t xml:space="preserve">0.85 ± 0.00</w:t>
+              <w:t xml:space="preserve">0.95 ± 0.00</w:t>
             </w:r>
           </w:p>
         </w:tc>
@@ -12767,7 +12775,7 @@
               <w:rPr>
                 <w:sz w:val="16"/>
               </w:rPr>
-              <w:t xml:space="preserve">0.0071 ± 0.0002</w:t>
+              <w:t xml:space="preserve">0.0071 ± 0.0001</w:t>
             </w:r>
           </w:p>
         </w:tc>
@@ -12785,7 +12793,7 @@
               <w:rPr>
                 <w:sz w:val="16"/>
               </w:rPr>
-              <w:t xml:space="preserve">0.0380 ± 0.0005</w:t>
+              <w:t xml:space="preserve">0.0358 ± 0.0004</w:t>
             </w:r>
           </w:p>
         </w:tc>
@@ -12803,7 +12811,7 @@
               <w:rPr>
                 <w:sz w:val="16"/>
               </w:rPr>
-              <w:t xml:space="preserve">0.264 ± 0.002</w:t>
+              <w:t xml:space="preserve">0.260 ± 0.001</w:t>
             </w:r>
           </w:p>
         </w:tc>
@@ -12819,9 +12827,11 @@
             </w:pPr>
             <w:r>
               <w:rPr>
-                <w:sz w:val="16"/>
-              </w:rPr>
-              <w:t xml:space="preserve">0.647 ± 0.035</w:t>
+                <w:b/>
+                <w:bCs/>
+                <w:sz w:val="16"/>
+              </w:rPr>
+              <w:t xml:space="preserve">0.629 ± 0.011</w:t>
             </w:r>
           </w:p>
         </w:tc>
@@ -12839,7 +12849,7 @@
               <w:rPr>
                 <w:sz w:val="16"/>
               </w:rPr>
-              <w:t xml:space="preserve">−8 ± 121</w:t>
+              <w:t xml:space="preserve">+7 ± 109</w:t>
             </w:r>
           </w:p>
         </w:tc>
@@ -12855,9 +12865,11 @@
             </w:pPr>
             <w:r>
               <w:rPr>
-                <w:sz w:val="16"/>
-              </w:rPr>
-              <w:t xml:space="preserve">0.96 ± 0.03</w:t>
+                <w:b/>
+                <w:bCs/>
+                <w:sz w:val="16"/>
+              </w:rPr>
+              <w:t xml:space="preserve">0.91 ± 0.02</w:t>
             </w:r>
           </w:p>
         </w:tc>
@@ -12911,9 +12923,11 @@
             </w:pPr>
             <w:r>
               <w:rPr>
-                <w:sz w:val="16"/>
-              </w:rPr>
-              <w:t xml:space="preserve">0.0072 ± 0.0001</w:t>
+                <w:b/>
+                <w:bCs/>
+                <w:sz w:val="16"/>
+              </w:rPr>
+              <w:t xml:space="preserve">0.0070 ± 0.0001</w:t>
             </w:r>
           </w:p>
         </w:tc>
@@ -12929,9 +12943,11 @@
             </w:pPr>
             <w:r>
               <w:rPr>
-                <w:sz w:val="16"/>
-              </w:rPr>
-              <w:t xml:space="preserve">0.0383 ± 0.0011</w:t>
+                <w:b/>
+                <w:bCs/>
+                <w:sz w:val="16"/>
+              </w:rPr>
+              <w:t xml:space="preserve">0.0348 ± 0.0019</w:t>
             </w:r>
           </w:p>
         </w:tc>
@@ -12947,9 +12963,11 @@
             </w:pPr>
             <w:r>
               <w:rPr>
-                <w:sz w:val="16"/>
-              </w:rPr>
-              <w:t xml:space="preserve">0.263 ± 0.006</w:t>
+                <w:b/>
+                <w:bCs/>
+                <w:sz w:val="16"/>
+              </w:rPr>
+              <w:t xml:space="preserve">0.254 ± 0.004</w:t>
             </w:r>
           </w:p>
         </w:tc>
@@ -12967,7 +12985,7 @@
               <w:rPr>
                 <w:sz w:val="16"/>
               </w:rPr>
-              <w:t xml:space="preserve">0.662 ± 0.009</w:t>
+              <w:t xml:space="preserve">0.652 ± 0.010</w:t>
             </w:r>
           </w:p>
         </w:tc>
@@ -12985,7 +13003,7 @@
               <w:rPr>
                 <w:sz w:val="16"/>
               </w:rPr>
-              <w:t xml:space="preserve">+4 ± 99</w:t>
+              <w:t xml:space="preserve">+13 ± 93</w:t>
             </w:r>
           </w:p>
         </w:tc>
@@ -13003,7 +13021,7 @@
               <w:rPr>
                 <w:sz w:val="16"/>
               </w:rPr>
-              <w:t xml:space="preserve">0.42 ± 0.06</w:t>
+              <w:t xml:space="preserve">0.51 ± 0.01</w:t>
             </w:r>
           </w:p>
         </w:tc>
@@ -13140,7 +13158,7 @@
         <w:t xml:space="preserve"> </w:t>
       </w:r>
       <w:r>
-        <w:t xml:space="preserve">Distribution of the per-utterance JawOpen lag between prediction and ground truth (positive = prediction late), seed 0, all 593 held-out utterances. With synchronous audio, all four models are centered on zero lag.</w:t>
+        <w:t xml:space="preserve">Distribution of the per-utterance JawOpen lag between prediction and ground truth (positive = prediction late), seed 0, all 6 000 held-out utterances. With synchronous audio, all four models are centered close to zero lag.</w:t>
       </w:r>
     </w:p>
     <w:p>
@@ -13172,7 +13190,7 @@
         <w:t xml:space="preserve"> </w:t>
       </w:r>
       <w:r>
-        <w:t xml:space="preserve">Compared with the offset run (Transformer, rule-derived labels: Val MSE 0.0075, BS-L2 p95 0.603, lag 81 ± 137 ms, velocity ratio 0.42), the re-run reaches lower error (0.0048, 0.520), zero mean lag (−5 ± 94 ms) and reference-level dynamics (1.01) with about a tenth of the training data. The low velocity ratios of the offset run were mostly a consequence of the offset, which forces an MSE-trained model to average over uncertain timing.</w:t>
+        <w:t xml:space="preserve">Compared with the offset run (Transformer, rule-derived labels: Val MSE 0.0075, BS-L2 p95 0.603, lag 81 ± 137 ms, velocity ratio 0.42), the re-run reaches lower error (0.0036, 0.487), near-zero mean lag (−10 ± 89 ms) and reference-level dynamics (1.07); the one-tenth preliminary run already gave 0.0048, 0.520, −5 ± 94 ms and 1.01. The low velocity ratios of the offset run were mostly a consequence of the offset, which forces an MSE-trained model to average over uncertain timing.</w:t>
       </w:r>
     </w:p>
     <w:p>
@@ -13196,7 +13214,7 @@
         <w:t xml:space="preserve"> </w:t>
       </w:r>
       <w:r>
-        <w:t xml:space="preserve">(BS-L2 μ 0.150 vs 0.201), as expected for deterministic labels that a bidirectional model can reconstruct from both past and future context.</w:t>
+        <w:t xml:space="preserve">(BS-L2 μ 0.094 vs 0.159), as expected for deterministic labels that a bidirectional model can reconstruct from both past and future context.</w:t>
       </w:r>
     </w:p>
     <w:p>
@@ -13214,13 +13232,13 @@
           <w:i/>
           <w:iCs/>
         </w:rPr>
-        <w:t xml:space="preserve">on video-measured labels, accuracy is equal but dynamics differ.</w:t>
-      </w:r>
-      <w:r>
-        <w:t xml:space="preserve"> </w:t>
-      </w:r>
-      <w:r>
-        <w:t xml:space="preserve">Both architectures reach the same error (BS-L2 μ 0.264 vs 0.263), but the BiLSTM collapses toward over-smoothed output (velocity ratio 0.42 ± 0.06) whereas the causal Transformer preserves the reference dynamics (0.96 ± 0.03). This confirms, over three seeds and with synchronous audio, the architectural observation of the offset run, and supports a causal Transformer as the backbone for a learned Layer 3.</w:t>
+        <w:t xml:space="preserve">on video-measured labels, accuracy is similar but dynamics differ.</w:t>
+      </w:r>
+      <w:r>
+        <w:t xml:space="preserve"> </w:t>
+      </w:r>
+      <w:r>
+        <w:t xml:space="preserve">The BiLSTM has a slightly lower mean error (BS-L2 μ 0.254 vs 0.260) but a higher p95 (0.652 vs 0.629), and it collapses toward over-smoothed output (velocity ratio 0.51 ± 0.01) whereas the causal Transformer preserves most of the reference dynamics (0.91 ± 0.02). This confirms, over three seeds and with synchronous audio, the architectural observation of the offset run, and supports a causal Transformer as the backbone for a learned Layer 3.</w:t>
       </w:r>
     </w:p>
     <w:p>
@@ -13229,15 +13247,6 @@
       </w:pPr>
       <w:r>
         <w:t xml:space="preserve">These regressors are reference models for characterizing the target representation and are not part of the training-free pipeline. The video-trained causal Transformer is also used as the LEARNED-sync baseline in Section V-D.</w:t>
-      </w:r>
-      <w:r>
-        <w:t xml:space="preserve"> </w:t>
-      </w:r>
-      <w:r>
-        <w:rPr>
-          <w:highlight w:val="yellow"/>
-        </w:rPr>
-        <w:t xml:space="preserve">TODO-E4b: optionally re-run on the full 1 000 utterances per speaker once the synchronous audio has been extracted from all videos.</w:t>
       </w:r>
     </w:p>
     <w:p>

</xml_diff>

<commit_message>
paper(revision): final manuscript with transcription-sync DOI and Atlas-MK37 attribution
Co-Authored-By: Claude Opus 5.5 (1M context) <noreply@anthropic.com>
</commit_message>
<xml_diff>
--- a/paper/revision/manuscript/TranscriptionSync_revised.docx
+++ b/paper/revision/manuscript/TranscriptionSync_revised.docx
@@ -390,7 +390,7 @@
         <w:pStyle w:val="BodyText"/>
       </w:pPr>
       <w:r>
-        <w:t xml:space="preserve">This section summarizes the assistant into which TranscriptionSync is integrated, as far as it matters for lip synchronization.</w:t>
+        <w:t xml:space="preserve">This section summarizes the assistant into which TranscriptionSync is integrated, as far as it matters for lip synchronization. A.T.L.A.S extends the open-source Atlas-MK37 desktop assistant by FatihMakes [48] (CC BY-NC 4.0), from which it inherits the Live API session loop, the 19-tool automation layer, the planner–executor agent and the persistent memory (Sections III-A to III-C); the browser VRM avatar, the viseme pipeline and the evaluation tooling were added for this work.</w:t>
       </w:r>
     </w:p>
     <w:p>
@@ -1769,7 +1769,7 @@
         <w:t xml:space="preserve"> </w:t>
       </w:r>
       <w:r>
-        <w:t xml:space="preserve">variant (TSYNC-ASR), incoming PCM chunks are appended to a rolling buffer and transcribed incrementally by an int8-quantized multilingual Whisper model on the CPU [31], [48] with word-level timestamps. Inference runs on a window of W = 3.2 s with hop h = 320 ms. A word wᵢ is finalized once its end time tᵢᵉ lies more than a guard interval g behind the buffer head; it is then emitted as the triple (textᵢ, tᵢˢ, tᵢᵉ) and not refined further. Substitution errors are partly tolerated: they tend to replace a word with a phonetically similar one, whose visemes are also similar, which is consistent with the gradual degradation observed in the layer-wise experiments (Section V-E).</w:t>
+        <w:t xml:space="preserve">variant (TSYNC-ASR), incoming PCM chunks are appended to a rolling buffer and transcribed incrementally by an int8-quantized multilingual Whisper model on the CPU [31], [49] with word-level timestamps. Inference runs on a window of W = 3.2 s with hop h = 320 ms. A word wᵢ is finalized once its end time tᵢᵉ lies more than a guard interval g behind the buffer head; it is then emitted as the triple (textᵢ, tᵢˢ, tᵢᵉ) and not refined further. Substitution errors are partly tolerated: they tend to replace a word with a phonetically similar one, whose visemes are also similar, which is consistent with the gradual degradation observed in the layer-wise experiments (Section V-E).</w:t>
       </w:r>
     </w:p>
     <w:p>
@@ -1801,7 +1801,7 @@
         <w:t xml:space="preserve"> </w:t>
       </w:r>
       <w:r>
-        <w:t xml:space="preserve">variant (TSYNC-CTC), Layer 1 does not recognize words at all. Native-audio APIs stream a text transcription of the response alongside the audio; for Gemini Live, the first transcription chunk arrives a mean 690 ms before the first audio chunk (50 responses, Section V-C), and further words follow at roughly speaking rate. Layer 1 then only has to place known words on the audio clock, which is a streaming forced-alignment problem. Every hop (h = 160 ms; 320 ms for MMS on the CPU), a compact CTC acoustic model (wav2vec2-base fine-tuned for English character recognition, 94 M parameters [49]; the multilingual MMS aligner, 315 M parameters [50], for other languages) computes character posteriors for the audio since the last committed word (plus a 300 ms left margin), and a free-end CTC Viterbi pass aligns the next words of the transcript to them, so that the best-scoring</w:t>
+        <w:t xml:space="preserve">variant (TSYNC-CTC), Layer 1 does not recognize words at all. Native-audio APIs stream a text transcription of the response alongside the audio; for Gemini Live, the first transcription chunk arrives a mean 690 ms before the first audio chunk (50 responses, Section V-C), and further words follow at roughly speaking rate. Layer 1 then only has to place known words on the audio clock, which is a streaming forced-alignment problem. Every hop (h = 160 ms; 320 ms for MMS on the CPU), a compact CTC acoustic model (wav2vec2-base fine-tuned for English character recognition, 94 M parameters [50]; the multilingual MMS aligner, 315 M parameters [51], for other languages) computes character posteriors for the audio since the last committed word (plus a 300 ms left margin), and a free-end CTC Viterbi pass aligns the next words of the transcript to them, so that the best-scoring</w:t>
       </w:r>
       <w:r>
         <w:t xml:space="preserve"> </w:t>
@@ -2651,7 +2651,7 @@
         <w:pStyle w:val="BodyText"/>
       </w:pPr>
       <w:r>
-        <w:t xml:space="preserve">Without the streaming recognizer, A.T.L.A.S runs a production variant that uses the API's untimed output transcription. This is the default configuration of the shipped system, and it is available in the project repository as the package transcription-sync (Appendix A). Letters of the transcription stream are consumed at a fixed articulation rate of ρ = 13 characters/s (≈150 words/min) and mapped through a grapheme-class viseme table (released; Table 3 lists the corresponding phoneme classes); spaces and punctuation render the inter-word closure pose. Each target pose is scaled by the audio amplitude: the RMS of each PCM chunk is compressed as E = min(0.42, 1.9 · RMS^0.55), smoothed by an asymmetric follower (attack 0.50, release 0.18), and applied as the gain g = min(1.4, 2.2 · E). When a pose does not specify MouthClose, a light rest closure max(0, 0.08 − 0.2 · JawOpen) is added. Poses are then smoothed per channel by a first-order filter (β = 0.40) applied once per character, that is, at the 13 Hz character cadence. In the live system the character clock starts when the first transcription chunk arrives, which precedes the audio by a mean 690 ms (n = 50 re-collected responses, Section V-C; an earlier in-app measurement over n = 7 turns gave 349 ms); the offline port used in Section V aligns it to the audio onset instead. The variant is training-free, ASR-free and adds no latency, but its timing is open-loop: articulation shapes and audio are coupled only through signal energy, and the character cadence is not re-anchored to the audio.</w:t>
+        <w:t xml:space="preserve">Without the streaming recognizer, A.T.L.A.S runs a production variant that uses the API's untimed output transcription. This is the default configuration of the shipped system, and its source is included in the released repository (Appendix A). Letters of the transcription stream are consumed at a fixed articulation rate of ρ = 13 characters/s (≈150 words/min) and mapped through a grapheme-class viseme table (released; Table 3 lists the corresponding phoneme classes); spaces and punctuation render the inter-word closure pose. Each target pose is scaled by the audio amplitude: the RMS of each PCM chunk is compressed as E = min(0.42, 1.9 · RMS^0.55), smoothed by an asymmetric follower (attack 0.50, release 0.18), and applied as the gain g = min(1.4, 2.2 · E). When a pose does not specify MouthClose, a light rest closure max(0, 0.08 − 0.2 · JawOpen) is added. Poses are then smoothed per channel by a first-order filter (β = 0.40) applied once per character, that is, at the 13 Hz character cadence. In the live system the character clock starts when the first transcription chunk arrives, which precedes the audio by a mean 690 ms (n = 50 re-collected responses, Section V-C; an earlier in-app measurement over n = 7 turns gave 349 ms); the offline port used in Section V aligns it to the audio onset instead. The variant is training-free, ASR-free and adds no latency, but its timing is open-loop: articulation shapes and audio are coupled only through signal energy, and the character cadence is not re-anchored to the audio.</w:t>
       </w:r>
     </w:p>
     <w:p>
@@ -2913,7 +2913,7 @@
         <w:t xml:space="preserve"> </w:t>
       </w:r>
       <w:r>
-        <w:t xml:space="preserve">[51], pretrained, applied to the rendered videos, with the standard talking-head metrics [39]: lip-sync error distance (LSE-D; lower is better) and lip-sync confidence (LSE-C; higher is better). (ii)</w:t>
+        <w:t xml:space="preserve">[52], pretrained, applied to the rendered videos, with the standard talking-head metrics [39]: lip-sync error distance (LSE-D; lower is better) and lip-sync confidence (LSE-C; higher is better). (ii)</w:t>
       </w:r>
       <w:r>
         <w:t xml:space="preserve"> </w:t>
@@ -2968,7 +2968,7 @@
         <w:t xml:space="preserve">Audio-visual lag</w:t>
       </w:r>
       <w:r>
-        <w:t xml:space="preserve">: the lag that maximizes the cross-correlation between the rendered mouth-opening signal and the audio envelope. We use the detectability thresholds of ITU-R BT.1359, +45 ms for sound leading vision and −125 ms for sound lagging vision [52]. Negative lag values below denote visemes leading the audio (sound lagging vision).</w:t>
+        <w:t xml:space="preserve">: the lag that maximizes the cross-correlation between the rendered mouth-opening signal and the audio envelope. We use the detectability thresholds of ITU-R BT.1359, +45 ms for sound leading vision and −125 ms for sound lagging vision [53]. Negative lag values below denote visemes leading the audio (sound lagging vision).</w:t>
       </w:r>
     </w:p>
     <w:p>
@@ -3043,7 +3043,7 @@
         <w:t xml:space="preserve"> </w:t>
       </w:r>
       <w:r>
-        <w:t xml:space="preserve">The evaluation avatar (untextured glTF head, human.glb) used for the objective evaluation, shown for one recorded utterance (chat00) at a single instant (t = 1.40 s) under the four anchor conditions (AMP, RATE, TSYNC, MFA). All scored videos drive this same untextured humanoid mesh with identical audio; only the mouth-region blendshape trajectory differs. The matte, texture-free surface (no skin detail, lip color or eye texture) is a stylization that SyncNet, trained on natural face video [51], was not designed for; Section V-C examines the consequences.</w:t>
+        <w:t xml:space="preserve">The evaluation avatar (untextured glTF head, human.glb) used for the objective evaluation, shown for one recorded utterance (chat00) at a single instant (t = 1.40 s) under the four anchor conditions (AMP, RATE, TSYNC, MFA). All scored videos drive this same untextured humanoid mesh with identical audio; only the mouth-region blendshape trajectory differs. The matte, texture-free surface (no skin detail, lip color or eye texture) is a stylization that SyncNet, trained on natural face video [52], was not designed for; Section V-C examines the consequences.</w:t>
       </w:r>
     </w:p>
     <w:p>
@@ -4034,7 +4034,7 @@
         <w:t xml:space="preserve"> </w:t>
       </w:r>
       <w:r>
-        <w:t xml:space="preserve">the audio envelope. MFA is almost aligned (15.7 ms). TSYNC (−52.7 ms) and TSYNC−dur (−42.7 ms) lead the audio by roughly 40–55 ms, which is smaller in magnitude than RATE's +91.0 ms lag and TSYNC−coart's −109.3 ms. TSYNC's absolute lag is significantly smaller than RATE's (paired Δ|lag| = −38 ms, 95% CI [−48, −29], p &lt; 10⁻⁷, r = 0.94) and TSYNC−coart's (Δ|lag| = −57 ms [−62, −50], p &lt; 10⁻⁹). A visual lead of about 50 ms corresponds to sound lagging vision and lies inside the −125 ms detectability threshold of BT.1359 [52], whereas RATE's +91 ms visual lag (sound leading) exceeds the +45 ms threshold. TSYNC−coart shares TSYNC's timing but differs in lag by 57 ms, which shows that the cross-correlation lag also depends on the</w:t>
+        <w:t xml:space="preserve">the audio envelope. MFA is almost aligned (15.7 ms). TSYNC (−52.7 ms) and TSYNC−dur (−42.7 ms) lead the audio by roughly 40–55 ms, which is smaller in magnitude than RATE's +91.0 ms lag and TSYNC−coart's −109.3 ms. TSYNC's absolute lag is significantly smaller than RATE's (paired Δ|lag| = −38 ms, 95% CI [−48, −29], p &lt; 10⁻⁷, r = 0.94) and TSYNC−coart's (Δ|lag| = −57 ms [−62, −50], p &lt; 10⁻⁹). A visual lead of about 50 ms corresponds to sound lagging vision and lies inside the −125 ms detectability threshold of BT.1359 [53], whereas RATE's +91 ms visual lag (sound leading) exceeds the +45 ms threshold. TSYNC−coart shares TSYNC's timing but differs in lag by 57 ms, which shows that the cross-correlation lag also depends on the</w:t>
       </w:r>
       <w:r>
         <w:t xml:space="preserve"> </w:t>
@@ -4149,7 +4149,7 @@
         <w:t xml:space="preserve"> </w:t>
       </w:r>
       <w:r>
-        <w:t xml:space="preserve">To separate what SyncNet does and does not measure on this avatar, we rendered 20 FLEURS English utterances [53] (natural read speech, mean 10.0 s; the same utterances as in Section V-F; independent of the evaluation material) with the AMP trajectory displaced by known offsets of −200 to +200 ms (nine offsets, 180 videos), plus RATE, TSYNC (small recognizer) and MFA at zero offset, and scored all 240 videos with the same SyncNet pipeline (Table 5).</w:t>
+        <w:t xml:space="preserve">To separate what SyncNet does and does not measure on this avatar, we rendered 20 FLEURS English utterances [54] (natural read speech, mean 10.0 s; the same utterances as in Section V-F; independent of the evaluation material) with the AMP trajectory displaced by known offsets of −200 to +200 ms (nine offsets, 180 videos), plus RATE, TSYNC (small recognizer) and MFA at zero offset, and scored all 240 videos with the same SyncNet pipeline (Table 5).</w:t>
       </w:r>
     </w:p>
     <w:p>
@@ -6596,7 +6596,7 @@
         <w:pStyle w:val="BodyText"/>
       </w:pPr>
       <w:r>
-        <w:t xml:space="preserve">LVD in Section V-C measures proximity to an oracle that shares TSYNC's viseme table and kernel. To test the conditions against real articulation, we use GRID [54] video. For a random subset of the held-out speakers s29–s34 (100 utterances per speaker, seed 0; 593 utterances after face-detection filtering), 14-channel ARKit blendshape trajectories were extracted from the video frames with MediaPipe FaceLandmarker [55] (25 fps, linearly resampled to 60 fps). All conditions were run on the video's own audio track, which is synchronous with the frames (the separately distributed GRID audio is silence-trimmed and offset from the video; Section V-E). The generators are the same as in Section V-C, with three additions. TSYNC is run with both the tiny and the small recognizer. LEARNED (Section V-A), the released checkpoint trained on offset audio, is complemented by LEARNED-sync, the causal Transformer of Section V-G re-trained on synchronous GRID audio with video-measured labels (preliminary one-tenth run, seed 0; in-domain: trained on speakers s1–s28 of the same corpus). Finally, NVIDIA Audio2Face-3D [15] (regression model v2.3, actor Mark, official open weights) is added as the state-of-the-art open learned model; it was not trained on GRID. Because the official SDK requires TensorRT, we run the released ONNX network with ONNX Runtime on the CPU and port to Python the SDK's skin post-processing (PCA reconstruction, face mask, upper/lower-face smoothing and strengths) and its regularized, bounded solve for the 52 ARKit blendshape weights; eye blinks, tongue and emotion inference are omitted, and the bounded least-squares problem is solved exactly rather than with the SDK's iterative solver. MFA here has oracle timing but is scored like any other condition.</w:t>
+        <w:t xml:space="preserve">LVD in Section V-C measures proximity to an oracle that shares TSYNC's viseme table and kernel. To test the conditions against real articulation, we use GRID [55] video. For a random subset of the held-out speakers s29–s34 (100 utterances per speaker, seed 0; 593 utterances after face-detection filtering), 14-channel ARKit blendshape trajectories were extracted from the video frames with MediaPipe FaceLandmarker [56] (25 fps, linearly resampled to 60 fps). All conditions were run on the video's own audio track, which is synchronous with the frames (the separately distributed GRID audio is silence-trimmed and offset from the video; Section V-E). The generators are the same as in Section V-C, with three additions. TSYNC is run with both the tiny and the small recognizer. LEARNED (Section V-A), the released checkpoint trained on offset audio, is complemented by LEARNED-sync, the causal Transformer of Section V-G re-trained on synchronous GRID audio with video-measured labels (preliminary one-tenth run, seed 0; in-domain: trained on speakers s1–s28 of the same corpus). Finally, NVIDIA Audio2Face-3D [15] (regression model v2.3, actor Mark, official open weights) is added as the state-of-the-art open learned model; it was not trained on GRID. Because the official SDK requires TensorRT, we run the released ONNX network with ONNX Runtime on the CPU and port to Python the SDK's skin post-processing (PCA reconstruction, face mask, upper/lower-face smoothing and strengths) and its regularized, bounded solve for the 52 ARKit blendshape weights; eye blinks, tongue and emotion inference are omitted, and the bounded least-squares problem is solved exactly rather than with the SDK's iterative solver. MFA here has oracle timing but is scored like any other condition.</w:t>
       </w:r>
     </w:p>
     <w:p>
@@ -8780,7 +8780,7 @@
         <w:pStyle w:val="BodyText"/>
       </w:pPr>
       <w:r>
-        <w:t xml:space="preserve">The end-to-end metrics above combine errors from all three layers. Layers 1 and 2 can be validated separately on the GRID audiovisual sentence corpus [54], which contains 1 000 read sentences from each of 34 speakers. Forced alignment (MFA [11]) of the studio-quality audio, where aligners operate near their ceiling, provides word- and phoneme-level reference timing. We use MFA rather than the corpus-distributed .align files as the reference, because the two are not on the same clock as the audio we align. The .align files are timed against the original, untrimmed recordings, whose audio is also the sound track of the GRID videos. The separately distributed 25 kHz audio edition is silence-trimmed: cross-correlating it with the video sound track (n = 177 utterances, normalized peak 0.975) shows that each file starts a mean 432 ms (SD 146 ms) into the original recording, which matches the mean .align onset of the first word (441 ms). This accounts for most of the offset of about −362 ms between the trimmed audio and the .align entries observed in our pipeline (the remainder reflects the difference between the energy-based onset and the first .align word boundary); it is an edition mismatch, not a timing error in the corpus or a unit-conversion error. In addition, in the Zenodo distribution of the corpus, 22 of the 34 speaker folders of alignments.zip hold another speaker's alignments (pairwise swaps such as s28↔s29 and s32↔s33, and a four-speaker cycle s10–s13); utterance identifiers must therefore be matched across folders. All timing references in this section come from MFA run on the trimmed audio, which is self-consistent.</w:t>
+        <w:t xml:space="preserve">The end-to-end metrics above combine errors from all three layers. Layers 1 and 2 can be validated separately on the GRID audiovisual sentence corpus [55], which contains 1 000 read sentences from each of 34 speakers. Forced alignment (MFA [11]) of the studio-quality audio, where aligners operate near their ceiling, provides word- and phoneme-level reference timing. We use MFA rather than the corpus-distributed .align files as the reference, because the two are not on the same clock as the audio we align. The .align files are timed against the original, untrimmed recordings, whose audio is also the sound track of the GRID videos. The separately distributed 25 kHz audio edition is silence-trimmed: cross-correlating it with the video sound track (n = 177 utterances, normalized peak 0.975) shows that each file starts a mean 432 ms (SD 146 ms) into the original recording, which matches the mean .align onset of the first word (441 ms). This accounts for most of the offset of about −362 ms between the trimmed audio and the .align entries observed in our pipeline (the remainder reflects the difference between the energy-based onset and the first .align word boundary); it is an edition mismatch, not a timing error in the corpus or a unit-conversion error. In addition, in the Zenodo distribution of the corpus, 22 of the 34 speaker folders of alignments.zip hold another speaker's alignments (pairwise swaps such as s28↔s29 and s32↔s33, and a four-speaker cycle s10–s13); utterance identifiers must therefore be matched across folders. All timing references in this section come from MFA run on the trimmed audio, which is self-consistent.</w:t>
       </w:r>
     </w:p>
     <w:p>
@@ -9422,7 +9422,7 @@
         <w:t xml:space="preserve"> </w:t>
       </w:r>
       <w:r>
-        <w:t xml:space="preserve">With correct word boundaries, the class-weighted allocation places phoneme midpoints within 18 ms (SD 16) of forced alignment, below both BT.1359 detectability thresholds (+45 ms / −125 ms) [52]. The margin over uniform splitting is modest on GRID (18 vs. 20 ms): the corpus's 51-word grammar consists of short words for which uniform allocation is already near-optimal. This result validates Eq. (4) but does not yet demonstrate the advantage of the weights on long conversational words.</w:t>
+        <w:t xml:space="preserve">With correct word boundaries, the class-weighted allocation places phoneme midpoints within 18 ms (SD 16) of forced alignment, below both BT.1359 detectability thresholds (+45 ms / −125 ms) [53]. The margin over uniform splitting is modest on GRID (18 vs. 20 ms): the corpus's 51-word grammar consists of short words for which uniform allocation is already near-optimal. This result validates Eq. (4) but does not yet demonstrate the advantage of the weights on long conversational words.</w:t>
       </w:r>
     </w:p>
     <w:p>
@@ -9534,7 +9534,7 @@
         <w:t xml:space="preserve"> </w:t>
       </w:r>
       <w:r>
-        <w:t xml:space="preserve">A straightforward benchmark (tools/layer1_bench.py) reports a word-emission lag of P95 = 214 ms for English (0.27–0.30 s when rerun on our hardware; Table 9, "Original clock"). It starts its wall clock at zero when the first window, which ends at stream time W = 3.2 s, is submitted, so the time needed for the first 3.2 s of audio to arrive is never counted, and negative lags are clipped to zero; the reported median of 0 ms is a direct symptom. We therefore re-measure L as defined in Section IV-B: audio arrives in real time, a window can be processed only after its audio has arrived and the previous window has finished, a window whose compute exceeds the hop is followed by the most recent audio (skip-ahead), and L is the wall-clock time from a word's end to its emission (layer1_wall.py). We report the as-designed protocol (first window after W) and a variant whose window grows from the first hop. The material is the 10 espeak-ng-synthesized sentences of the Layers 2–3 benchmark (5 English, 5 Turkish) and, as natural speech, 20 FLEURS test utterances per language [53] (English mean 10.0 s, Turkish 12.8 s).</w:t>
+        <w:t xml:space="preserve">A straightforward benchmark (tools/layer1_bench.py) reports a word-emission lag of P95 = 214 ms for English (0.27–0.30 s when rerun on our hardware; Table 9, "Original clock"). It starts its wall clock at zero when the first window, which ends at stream time W = 3.2 s, is submitted, so the time needed for the first 3.2 s of audio to arrive is never counted, and negative lags are clipped to zero; the reported median of 0 ms is a direct symptom. We therefore re-measure L as defined in Section IV-B: audio arrives in real time, a window can be processed only after its audio has arrived and the previous window has finished, a window whose compute exceeds the hop is followed by the most recent audio (skip-ahead), and L is the wall-clock time from a word's end to its emission (layer1_wall.py). We report the as-designed protocol (first window after W) and a variant whose window grows from the first hop. The material is the 10 espeak-ng-synthesized sentences of the Layers 2–3 benchmark (5 English, 5 Turkish) and, as natural speech, 20 FLEURS test utterances per language [54] (English mean 10.0 s, Turkish 12.8 s).</w:t>
       </w:r>
     </w:p>
     <w:p>
@@ -10715,7 +10715,7 @@
         <w:t xml:space="preserve">the playout buffer required by Eq. (3) is about 3.4 s, not the ≈ 215 ms implied by the original benchmark</w:t>
       </w:r>
       <w:r>
-        <w:t xml:space="preserve">: with the tiny model on natural English speech, L has a median of 1.33 s and a P95 of 3.37 s; starting with a growing window lowers the median to 0.93 s but not the P95 (3.22 s). The P95 is dominated by the window/guard finalization policy, under which the last words of a window are withheld until later windows confirm them, rather than by compute. A 3 s response delay is incompatible with conversational turn-taking, so the recognition variant of Layer 1 is not deployable live; finalization based on agreement between consecutive hypotheses [48] does not fix this, whereas streaming alignment does (below). Second,</w:t>
+        <w:t xml:space="preserve">: with the tiny model on natural English speech, L has a median of 1.33 s and a P95 of 3.37 s; starting with a growing window lowers the median to 0.93 s but not the P95 (3.22 s). The P95 is dominated by the window/guard finalization policy, under which the last words of a window are withheld until later windows confirm them, rather than by compute. A 3 s response delay is incompatible with conversational turn-taking, so the recognition variant of Layer 1 is not deployable live; finalization based on agreement between consecutive hypotheses [49] does not fix this, whereas streaming alignment does (below). Second,</w:t>
       </w:r>
       <w:r>
         <w:t xml:space="preserve"> </w:t>
@@ -10759,7 +10759,7 @@
         <w:t xml:space="preserve"> </w:t>
       </w:r>
       <w:r>
-        <w:t xml:space="preserve">Table 10 reports the same wall-clock measurement for the alignment variant, together with LocalAgreement-2 finalization [48] as an alternative recognition policy. LocalAgreement does not help on this hardware (tiny model, median 1.41 s, P95 3.29 s, and only about 70% of words committed exactly). Streaming CTC alignment of the transcript does: with wav2vec2-base on the CPU, the per-hop compute is about 45 ms, the aligner keeps up with a 160 ms hop, and the word-emission latency has a median of 307 ms and a P95 of 677 ms on FLEURS English (316 / 556 ms on GRID); the pause rule lowers the P95 from 981 ms. Accuracy is essentially unchanged by streaming: 82% of word starts fall within 100 ms of MFA (median error 60 ms), against 84% for offline alignment with the same model and 53% for LocalAgreement. For Turkish, the multilingual MMS aligner is slower on the CPU (160 ms per 320 ms hop; median 555 ms, P95 1.19 s) and real-time with a large margin on a laptop GPU (11 ms per hop; median 274 ms, P95 766 ms). Against MFA with its Turkish acoustic model, 93% of Turkish word starts fall within 100 ms (median error 30 ms, MAE 46 ms), on both devices.</w:t>
+        <w:t xml:space="preserve">Table 10 reports the same wall-clock measurement for the alignment variant, together with LocalAgreement-2 finalization [49] as an alternative recognition policy. LocalAgreement does not help on this hardware (tiny model, median 1.41 s, P95 3.29 s, and only about 70% of words committed exactly). Streaming CTC alignment of the transcript does: with wav2vec2-base on the CPU, the per-hop compute is about 45 ms, the aligner keeps up with a 160 ms hop, and the word-emission latency has a median of 307 ms and a P95 of 677 ms on FLEURS English (316 / 556 ms on GRID); the pause rule lowers the P95 from 981 ms. Accuracy is essentially unchanged by streaming: 82% of word starts fall within 100 ms of MFA (median error 60 ms), against 84% for offline alignment with the same model and 53% for LocalAgreement. For Turkish, the multilingual MMS aligner is slower on the CPU (160 ms per 320 ms hop; median 555 ms, P95 1.19 s) and real-time with a large margin on a laptop GPU (11 ms per hop; median 274 ms, P95 766 ms). Against MFA with its Turkish acoustic model, 93% of Turkish word starts fall within 100 ms (median error 30 ms, MAE 46 ms), on both devices.</w:t>
       </w:r>
     </w:p>
     <w:p>
@@ -12195,7 +12195,7 @@
         <w:t xml:space="preserve"> </w:t>
       </w:r>
       <w:r>
-        <w:t xml:space="preserve">labels are MediaPipe FaceLandmarker [55] blendshape scores extracted from the GRID video frames (25 fps, linearly resampled to 60 fps).</w:t>
+        <w:t xml:space="preserve">labels are MediaPipe FaceLandmarker [56] blendshape scores extracted from the GRID video frames (25 fps, linearly resampled to 60 fps).</w:t>
       </w:r>
     </w:p>
     <w:p>
@@ -13462,7 +13462,7 @@
         <w:pStyle w:val="BodyText"/>
       </w:pPr>
       <w:r>
-        <w:t xml:space="preserve">The findings point to three concrete steps. (i) Add a fallback to recognition for words that the streamed transcription gets wrong, instrument the alignment variant inside the running assistant, and extend the video-based evaluation to Turkish audiovisual material. (ii) Use word timestamps where APIs provide them and evaluate Layers 2–3 on that input directly. (iii) Run a perceptual study (MOS and paired preferences) comparing RATE, TranscriptionSync, Audio2Face-3D and the oracle, with instruments such as the System Usability Scale [56], [57], the User Engagement Scale [58] and trust-in-automation measures [59], and repeat the video-based evaluation on conversational audiovisual corpora such as LRS3-TED [60], for which audio-visual speech representations [61] could also provide a synchronization metric valid for avatars.</w:t>
+        <w:t xml:space="preserve">The findings point to three concrete steps. (i) Add a fallback to recognition for words that the streamed transcription gets wrong, instrument the alignment variant inside the running assistant, and extend the video-based evaluation to Turkish audiovisual material. (ii) Use word timestamps where APIs provide them and evaluate Layers 2–3 on that input directly. (iii) Run a perceptual study (MOS and paired preferences) comparing RATE, TranscriptionSync, Audio2Face-3D and the oracle, with instruments such as the System Usability Scale [57], [58], the User Engagement Scale [59] and trust-in-automation measures [60], and repeat the video-based evaluation on conversational audiovisual corpora such as LRS3-TED [61], for which audio-visual speech representations [62] could also provide a synchronization metric valid for avatars.</w:t>
       </w:r>
     </w:p>
     <w:p>
@@ -13494,31 +13494,7 @@
         <w:pStyle w:val="BodyText"/>
       </w:pPr>
       <w:r>
-        <w:t xml:space="preserve">The RATE streaming viseme engine (Section IV-F), including the grapheme-class viseme table and the amplitude envelope helper, is released under the MIT license as the Python package transcription-sync (https://github.com/wpu-research/transcription-sync)</w:t>
-      </w:r>
-      <w:r>
-        <w:t xml:space="preserve"> </w:t>
-      </w:r>
-      <w:r>
-        <w:rPr>
-          <w:highlight w:val="yellow"/>
-        </w:rPr>
-        <w:t xml:space="preserve">TODO-H1: make the repository public and add an archived DOI, e.g., Zenodo</w:t>
-      </w:r>
-      <w:r>
-        <w:t xml:space="preserve">. The TranscriptionSync Layers 1–3 (streaming ASR and CTC alignment, G2P and duration estimation, kernel synthesis), the full ARPAbet/Turkish viseme table, the benchmarks (tools/layer1_bench.py, tools/layer23_bench.py, the wall-clock and streaming-alignment simulators layer1_wall.py and layer1_stream.py), the evaluation scripts and the complete A.T.L.A.S source (approximately 14 900 lines of Python and JavaScript) will be released in the same repository</w:t>
-      </w:r>
-      <w:r>
-        <w:t xml:space="preserve"> </w:t>
-      </w:r>
-      <w:r>
-        <w:rPr>
-          <w:highlight w:val="yellow"/>
-        </w:rPr>
-        <w:t xml:space="preserve">TODO-H1: confirm and add before submission</w:t>
-      </w:r>
-      <w:r>
-        <w:t xml:space="preserve">.</w:t>
+        <w:t xml:space="preserve">The TranscriptionSync code is available under the MIT license at https://github.com/wpu-research/transcription-sync, and the version used in this paper is archived on Zenodo (doi: 10.5281/zenodo.22997553; all versions: doi: 10.5281/zenodo.22997552). It comprises the RATE viseme engine with its grapheme-class table (Section IV-F, Python package transcription-sync), the evaluation modules (TranscriptionSync Layers 1–3 with streaming recognition and CTC alignment, the full ARPAbet/Turkish viseme table, the condition generators and the Layer-1 and Layer-2/3 benchmarks) and, under paper/revision, all scripts of the evaluation in Section V: the wall-clock and streaming-alignment Layer-1 simulators, the GRID video-based evaluation including the Audio2Face-3D port, the SyncNet offset test, the regressor re-training and the live Gemini re-evaluation. Datasets (GRID, FLEURS), third-party model weights and the recorded Gemini responses are not redistributed; the scripts download or regenerate them. The host assistant A.T.L.A.S (Section III) is available at https://github.com/wpu-research/A.T.L.A.S under CC BY-NC 4.0; it extends the open-source Atlas-MK37 assistant by FatihMakes [48].</w:t>
       </w:r>
     </w:p>
     <w:p>
@@ -14391,7 +14367,15 @@
         <w:pStyle w:val="RefText"/>
       </w:pPr>
       <w:r>
-        <w:t xml:space="preserve">[48] D. Macháček, R. Dabre, and O. Bojar, "Turning Whisper into real-time transcription system," in</w:t>
+        <w:t xml:space="preserve">[48] FatihMakes, "Atlas-MK37 (MARK XXXVII): Cross-platform personal AI assistant," GitHub repository, 2026. [Online]. Available: https://github.com/FatihMakes/Atlas-MK37</w:t>
+      </w:r>
+    </w:p>
+    <w:p>
+      <w:pPr>
+        <w:pStyle w:val="RefText"/>
+      </w:pPr>
+      <w:r>
+        <w:t xml:space="preserve">[49] D. Macháček, R. Dabre, and O. Bojar, "Turning Whisper into real-time transcription system," in</w:t>
       </w:r>
       <w:r>
         <w:t xml:space="preserve"> </w:t>
@@ -14412,7 +14396,7 @@
         <w:pStyle w:val="RefText"/>
       </w:pPr>
       <w:r>
-        <w:t xml:space="preserve">[49] A. Baevski, Y. Zhou, A. Mohamed, and M. Auli, "wav2vec 2.0: A framework for self-supervised learning of speech representations," in</w:t>
+        <w:t xml:space="preserve">[50] A. Baevski, Y. Zhou, A. Mohamed, and M. Auli, "wav2vec 2.0: A framework for self-supervised learning of speech representations," in</w:t>
       </w:r>
       <w:r>
         <w:t xml:space="preserve"> </w:t>
@@ -14433,7 +14417,7 @@
         <w:pStyle w:val="RefText"/>
       </w:pPr>
       <w:r>
-        <w:t xml:space="preserve">[50] V. Pratap et al., "Scaling speech technology to 1,000+ languages,"</w:t>
+        <w:t xml:space="preserve">[51] V. Pratap et al., "Scaling speech technology to 1,000+ languages,"</w:t>
       </w:r>
       <w:r>
         <w:t xml:space="preserve"> </w:t>
@@ -14454,7 +14438,7 @@
         <w:pStyle w:val="RefText"/>
       </w:pPr>
       <w:r>
-        <w:t xml:space="preserve">[51] J. S. Chung and A. Zisserman, "Out of time: Automated lip sync in the wild," in</w:t>
+        <w:t xml:space="preserve">[52] J. S. Chung and A. Zisserman, "Out of time: Automated lip sync in the wild," in</w:t>
       </w:r>
       <w:r>
         <w:t xml:space="preserve"> </w:t>
@@ -14475,7 +14459,7 @@
         <w:pStyle w:val="RefText"/>
       </w:pPr>
       <w:r>
-        <w:t xml:space="preserve">[52] International Telecommunication Union, "Relative timing of sound and vision for broadcasting," ITU-R Recommendation BT.1359-1, 1998.</w:t>
+        <w:t xml:space="preserve">[53] International Telecommunication Union, "Relative timing of sound and vision for broadcasting," ITU-R Recommendation BT.1359-1, 1998.</w:t>
       </w:r>
     </w:p>
     <w:p>
@@ -14483,7 +14467,7 @@
         <w:pStyle w:val="RefText"/>
       </w:pPr>
       <w:r>
-        <w:t xml:space="preserve">[53] A. Conneau et al., "FLEURS: Few-shot learning evaluation of universal representations of speech," in</w:t>
+        <w:t xml:space="preserve">[54] A. Conneau et al., "FLEURS: Few-shot learning evaluation of universal representations of speech," in</w:t>
       </w:r>
       <w:r>
         <w:t xml:space="preserve"> </w:t>
@@ -14504,7 +14488,7 @@
         <w:pStyle w:val="RefText"/>
       </w:pPr>
       <w:r>
-        <w:t xml:space="preserve">[54] M. Cooke, J. Barker, S. Cunningham, and X. Shao, "An audio-visual corpus for speech perception and automatic speech recognition,"</w:t>
+        <w:t xml:space="preserve">[55] M. Cooke, J. Barker, S. Cunningham, and X. Shao, "An audio-visual corpus for speech perception and automatic speech recognition,"</w:t>
       </w:r>
       <w:r>
         <w:t xml:space="preserve"> </w:t>
@@ -14525,7 +14509,7 @@
         <w:pStyle w:val="RefText"/>
       </w:pPr>
       <w:r>
-        <w:t xml:space="preserve">[55] C. Lugaresi et al., "MediaPipe: A framework for building perception pipelines,"</w:t>
+        <w:t xml:space="preserve">[56] C. Lugaresi et al., "MediaPipe: A framework for building perception pipelines,"</w:t>
       </w:r>
       <w:r>
         <w:t xml:space="preserve"> </w:t>
@@ -14546,7 +14530,7 @@
         <w:pStyle w:val="RefText"/>
       </w:pPr>
       <w:r>
-        <w:t xml:space="preserve">[56] J. Brooke, "SUS: A 'quick and dirty' usability scale," in</w:t>
+        <w:t xml:space="preserve">[57] J. Brooke, "SUS: A 'quick and dirty' usability scale," in</w:t>
       </w:r>
       <w:r>
         <w:t xml:space="preserve"> </w:t>
@@ -14567,7 +14551,7 @@
         <w:pStyle w:val="RefText"/>
       </w:pPr>
       <w:r>
-        <w:t xml:space="preserve">[57] A. Bangor, P. T. Kortum, and J. T. Miller, "An empirical evaluation of the System Usability Scale,"</w:t>
+        <w:t xml:space="preserve">[58] A. Bangor, P. T. Kortum, and J. T. Miller, "An empirical evaluation of the System Usability Scale,"</w:t>
       </w:r>
       <w:r>
         <w:t xml:space="preserve"> </w:t>
@@ -14588,7 +14572,7 @@
         <w:pStyle w:val="RefText"/>
       </w:pPr>
       <w:r>
-        <w:t xml:space="preserve">[58] H. L. O'Brien, P. Cairns, and M. Hall, "A practical approach to measuring user engagement with the refined user engagement scale (UES) and new UES short form,"</w:t>
+        <w:t xml:space="preserve">[59] H. L. O'Brien, P. Cairns, and M. Hall, "A practical approach to measuring user engagement with the refined user engagement scale (UES) and new UES short form,"</w:t>
       </w:r>
       <w:r>
         <w:t xml:space="preserve"> </w:t>
@@ -14609,7 +14593,7 @@
         <w:pStyle w:val="RefText"/>
       </w:pPr>
       <w:r>
-        <w:t xml:space="preserve">[59] J.-Y. Jian, A. M. Bisantz, and C. G. Drury, "Foundations for an empirically determined scale of trust in automated systems,"</w:t>
+        <w:t xml:space="preserve">[60] J.-Y. Jian, A. M. Bisantz, and C. G. Drury, "Foundations for an empirically determined scale of trust in automated systems,"</w:t>
       </w:r>
       <w:r>
         <w:t xml:space="preserve"> </w:t>
@@ -14630,7 +14614,7 @@
         <w:pStyle w:val="RefText"/>
       </w:pPr>
       <w:r>
-        <w:t xml:space="preserve">[60] T. Afouras, J. S. Chung, and A. Zisserman, "LRS3-TED: A large-scale dataset for visual speech recognition,"</w:t>
+        <w:t xml:space="preserve">[61] T. Afouras, J. S. Chung, and A. Zisserman, "LRS3-TED: A large-scale dataset for visual speech recognition,"</w:t>
       </w:r>
       <w:r>
         <w:t xml:space="preserve"> </w:t>
@@ -14651,7 +14635,7 @@
         <w:pStyle w:val="RefText"/>
       </w:pPr>
       <w:r>
-        <w:t xml:space="preserve">[61] B. Shi, W.-N. Hsu, K. Lakhotia, and A. Mohamed, "Learning audio-visual speech representation by masked multimodal cluster prediction," in</w:t>
+        <w:t xml:space="preserve">[62] B. Shi, W.-N. Hsu, K. Lakhotia, and A. Mohamed, "Learning audio-visual speech representation by masked multimodal cluster prediction," in</w:t>
       </w:r>
       <w:r>
         <w:t xml:space="preserve"> </w:t>

</xml_diff>